<commit_message>
Draw the 3 schematic figures + add Chinese draft (both languages, figures embedded)
- paper/make_figures.py: generates the three schematic figures —
  fig1_networks (the three test-network topologies), fig2_compressor (characteristic map +
  the disconnected feasible action set, computed from the real envs/compressor.py model,
  alpha_on≈1.29), fig3_method (CMDP loop → constrained SAC → MPC distillation).
- paper/draft.md: replace the [INSERT FIGURE] callouts with the actual embedded figures
  (now Figs 1-3 schematic + 4-9 results). Regenerated paper/draft.docx (9 figures).
- paper/draft_zh.md + draft_zh.docx: full Chinese translation, same equations/tables/figures
  (Chinese captions), references kept in English.

Co-Authored-By: Claude Opus 4.8 <noreply@anthropic.com>
</commit_message>
<xml_diff>
--- a/paper/draft.docx
+++ b/paper/draft.docx
@@ -36,7 +36,7 @@
         </w:p>
       </w:sdtContent>
     </w:sdt>
-    <w:bookmarkStart w:id="61" w:name="X08838f8191057507e4ebd8c290734ad44122935"/>
+    <w:bookmarkStart w:id="70" w:name="X08838f8191057507e4ebd8c290734ad44122935"/>
     <w:p>
       <w:pPr>
         <w:pStyle w:val="Heading1"/>
@@ -1982,7 +1982,7 @@
     </w:p>
     <w:bookmarkEnd w:id="17"/>
     <w:bookmarkEnd w:id="18"/>
-    <w:bookmarkStart w:id="23" w:name="problem-formulation"/>
+    <w:bookmarkStart w:id="29" w:name="problem-formulation"/>
     <w:p>
       <w:pPr>
         <w:pStyle w:val="Heading2"/>
@@ -1991,7 +1991,7 @@
         <w:t xml:space="preserve">3. Problem formulation</w:t>
       </w:r>
     </w:p>
-    <w:bookmarkStart w:id="19" w:name="network-and-hydraulics"/>
+    <w:bookmarkStart w:id="22" w:name="network-and-hydraulics"/>
     <w:p>
       <w:pPr>
         <w:pStyle w:val="Heading3"/>
@@ -2002,121 +2002,62 @@
     </w:p>
     <w:p>
       <w:pPr>
-        <w:pStyle w:val="BlockText"/>
-      </w:pPr>
-      <w:r>
-        <w:t xml:space="preserve">🖼️</w:t>
-      </w:r>
-      <w:r>
-        <w:t xml:space="preserve"> </w:t>
-      </w:r>
-      <w:r>
-        <w:rPr>
-          <w:b/>
-          <w:bCs/>
-        </w:rPr>
-        <w:t xml:space="preserve">[INSERT FIGURE 1 — System schematic.]</w:t>
-      </w:r>
-      <w:r>
-        <w:t xml:space="preserve"> </w:t>
-      </w:r>
-      <w:r>
-        <w:t xml:space="preserve">A 3-panel schematic of the test networks: (a) the</w:t>
-      </w:r>
-      <w:r>
-        <w:t xml:space="preserve"> </w:t>
-      </w:r>
-      <w:r>
-        <w:t xml:space="preserve">gun-barrel element (source compressor → node 2 → demand node 3); (b) the branched benchmark</w:t>
-      </w:r>
-      <w:r>
-        <w:t xml:space="preserve"> </w:t>
-      </w:r>
-      <w:r>
-        <w:t xml:space="preserve">(junction splitting to two demand nodes); (c) the GasLib-40-derived chain (innode_6 → sink_13 →</w:t>
-      </w:r>
-      <w:r>
-        <w:t xml:space="preserve"> </w:t>
-      </w:r>
-      <w:r>
-        <w:t xml:space="preserve">sink_14 → sink_10). Annotate the source compressor, pipes (</w:t>
-      </w:r>
-      <m:oMath>
-        <m:sSub>
-          <m:e>
-            <m:r>
-              <m:t>K</m:t>
-            </m:r>
-          </m:e>
-          <m:sub>
-            <m:r>
-              <m:t>e</m:t>
-            </m:r>
-          </m:sub>
-        </m:sSub>
-      </m:oMath>
-      <w:r>
-        <w:t xml:space="preserve">), node line-pack (</w:t>
-      </w:r>
-      <m:oMath>
-        <m:sSub>
-          <m:e>
-            <m:r>
-              <m:t>β</m:t>
-            </m:r>
-          </m:e>
-          <m:sub>
-            <m:r>
-              <m:t>i</m:t>
-            </m:r>
-          </m:sub>
-        </m:sSub>
-      </m:oMath>
-      <w:r>
-        <w:t xml:space="preserve">),</w:t>
-      </w:r>
-      <w:r>
-        <w:t xml:space="preserve"> </w:t>
-      </w:r>
-      <w:r>
-        <w:t xml:space="preserve">and demand nodes.</w:t>
-      </w:r>
-      <w:r>
-        <w:t xml:space="preserve"> </w:t>
-      </w:r>
-      <w:r>
-        <w:rPr>
-          <w:i/>
-          <w:iCs/>
-        </w:rPr>
-        <w:t xml:space="preserve">(Suggested: draw from the incidence matrices in</w:t>
-      </w:r>
-      <w:r>
-        <w:rPr>
-          <w:i/>
-          <w:iCs/>
-        </w:rPr>
-        <w:t xml:space="preserve"> </w:t>
-      </w:r>
-      <w:r>
-        <w:rPr>
-          <w:rStyle w:val="VerbatimChar"/>
-          <w:i/>
-          <w:iCs/>
-        </w:rPr>
-        <w:t xml:space="preserve">envs/pipeline_env.py</w:t>
-      </w:r>
-      <w:r>
-        <w:rPr>
-          <w:i/>
-          <w:iCs/>
-        </w:rPr>
-        <w:t xml:space="preserve">.)</w:t>
-      </w:r>
-    </w:p>
-    <w:p>
-      <w:pPr>
-        <w:pStyle w:val="FirstParagraph"/>
+        <w:pStyle w:val="CaptionedFigure"/>
+      </w:pPr>
+      <w:r>
+        <w:drawing>
+          <wp:inline>
+            <wp:extent cx="5334000" cy="1538176"/>
+            <wp:effectExtent b="0" l="0" r="0" t="0"/>
+            <wp:docPr descr="Figure 1. The three test networks: (a) gun-barrel element, (b) branched benchmark, (c) GasLib-40-derived demand chain (pipe lengths shown). S = source node with the electric compressor (α); shaded = demand node." title="" id="20" name="Picture"/>
+            <a:graphic>
+              <a:graphicData uri="http://schemas.openxmlformats.org/drawingml/2006/picture">
+                <pic:pic>
+                  <pic:nvPicPr>
+                    <pic:cNvPr descr="fig1_networks.png" id="21" name="Picture"/>
+                    <pic:cNvPicPr>
+                      <a:picLocks noChangeArrowheads="1" noChangeAspect="1"/>
+                    </pic:cNvPicPr>
+                  </pic:nvPicPr>
+                  <pic:blipFill>
+                    <a:blip r:embed="rId19"/>
+                    <a:stretch>
+                      <a:fillRect/>
+                    </a:stretch>
+                  </pic:blipFill>
+                  <pic:spPr bwMode="auto">
+                    <a:xfrm>
+                      <a:off x="0" y="0"/>
+                      <a:ext cx="5334000" cy="1538176"/>
+                    </a:xfrm>
+                    <a:prstGeom prst="rect">
+                      <a:avLst/>
+                    </a:prstGeom>
+                    <a:noFill/>
+                    <a:ln w="9525">
+                      <a:noFill/>
+                      <a:headEnd/>
+                      <a:tailEnd/>
+                    </a:ln>
+                  </pic:spPr>
+                </pic:pic>
+              </a:graphicData>
+            </a:graphic>
+          </wp:inline>
+        </w:drawing>
+      </w:r>
+    </w:p>
+    <w:p>
+      <w:pPr>
+        <w:pStyle w:val="ImageCaption"/>
+      </w:pPr>
+      <w:r>
+        <w:t xml:space="preserve">Figure 1. The three test networks: (a) gun-barrel element, (b) branched benchmark, (c) GasLib-40-derived demand chain (pipe lengths shown). S = source node with the electric compressor (α); shaded = demand node.</w:t>
+      </w:r>
+    </w:p>
+    <w:p>
+      <w:pPr>
+        <w:pStyle w:val="BodyText"/>
       </w:pPr>
       <w:r>
         <w:t xml:space="preserve">We consider a gun-barrel element: a source node, an internal node (2), and a demand node</w:t>
@@ -2662,8 +2603,8 @@
         <w:t xml:space="preserve">Eqs. (1)–(6),(16) of [1].</w:t>
       </w:r>
     </w:p>
-    <w:bookmarkEnd w:id="19"/>
-    <w:bookmarkStart w:id="20" w:name="X4dd447cc627911c88b47c3ff5b8035e67ddc63b"/>
+    <w:bookmarkEnd w:id="22"/>
+    <w:bookmarkStart w:id="26" w:name="X4dd447cc627911c88b47c3ff5b8035e67ddc63b"/>
     <w:p>
       <w:pPr>
         <w:pStyle w:val="Heading3"/>
@@ -3871,431 +3812,62 @@
     </w:p>
     <w:p>
       <w:pPr>
-        <w:pStyle w:val="BlockText"/>
-      </w:pPr>
-      <w:r>
-        <w:t xml:space="preserve">🖼️</w:t>
-      </w:r>
-      <w:r>
-        <w:t xml:space="preserve"> </w:t>
-      </w:r>
-      <w:r>
-        <w:rPr>
-          <w:b/>
-          <w:bCs/>
-        </w:rPr>
-        <w:t xml:space="preserve">[INSERT FIGURE 2 — Compressor map and the disconnected feasible set.]</w:t>
-      </w:r>
-      <w:r>
-        <w:t xml:space="preserve"> </w:t>
-      </w:r>
-      <w:r>
-        <w:rPr>
-          <w:i/>
-          <w:iCs/>
-        </w:rPr>
-        <w:t xml:space="preserve">(The single most</w:t>
-      </w:r>
-      <w:r>
-        <w:rPr>
-          <w:i/>
-          <w:iCs/>
-        </w:rPr>
-        <w:t xml:space="preserve"> </w:t>
-      </w:r>
-      <w:r>
-        <w:rPr>
-          <w:i/>
-          <w:iCs/>
-        </w:rPr>
-        <w:t xml:space="preserve">important conceptual figure — it carries the paper’s key contribution.)</w:t>
-      </w:r>
-      <w:r>
-        <w:t xml:space="preserve"> </w:t>
-      </w:r>
-      <w:r>
-        <w:t xml:space="preserve">Left: the centrifugal</w:t>
-      </w:r>
-      <w:r>
-        <w:t xml:space="preserve"> </w:t>
-      </w:r>
-      <w:r>
-        <w:t xml:space="preserve">characteristic map (</w:t>
-      </w:r>
-      <m:oMath>
-        <m:r>
-          <m:t>η</m:t>
-        </m:r>
-      </m:oMath>
-      <w:r>
-        <w:t xml:space="preserve"> </w:t>
-      </w:r>
-      <w:r>
-        <w:t xml:space="preserve">and</w:t>
-      </w:r>
-      <w:r>
-        <w:t xml:space="preserve"> </w:t>
-      </w:r>
-      <m:oMath>
-        <m:r>
-          <m:t>H</m:t>
-        </m:r>
-        <m:r>
-          <m:rPr>
-            <m:sty m:val="p"/>
-          </m:rPr>
-          <m:t>/</m:t>
-        </m:r>
-        <m:sSup>
-          <m:e>
-            <m:r>
-              <m:t>ω</m:t>
-            </m:r>
-          </m:e>
-          <m:sup>
-            <m:r>
-              <m:t>2</m:t>
-            </m:r>
-          </m:sup>
-        </m:sSup>
-      </m:oMath>
-      <w:r>
-        <w:t xml:space="preserve"> </w:t>
-      </w:r>
-      <w:r>
-        <w:t xml:space="preserve">vs</w:t>
-      </w:r>
-      <w:r>
-        <w:t xml:space="preserve"> </w:t>
-      </w:r>
-      <m:oMath>
-        <m:r>
-          <m:t>ϕ</m:t>
-        </m:r>
-        <m:r>
-          <m:rPr>
-            <m:sty m:val="p"/>
-          </m:rPr>
-          <m:t>=</m:t>
-        </m:r>
-        <m:sSub>
-          <m:e>
-            <m:r>
-              <m:t>Q</m:t>
-            </m:r>
-          </m:e>
-          <m:sub>
-            <m:r>
-              <m:t>i</m:t>
-            </m:r>
-            <m:r>
-              <m:t>n</m:t>
-            </m:r>
-          </m:sub>
-        </m:sSub>
-        <m:r>
-          <m:rPr>
-            <m:sty m:val="p"/>
-          </m:rPr>
-          <m:t>/</m:t>
-        </m:r>
-        <m:r>
-          <m:t>ω</m:t>
-        </m:r>
-      </m:oMath>
-      <w:r>
-        <w:t xml:space="preserve">, Eqs. (2)–(3)), shading the</w:t>
-      </w:r>
-      <w:r>
-        <w:t xml:space="preserve"> </w:t>
-      </w:r>
-      <w:r>
-        <w:t xml:space="preserve">infeasible surge/choke and speed regions. Right: the resulting</w:t>
-      </w:r>
-      <w:r>
-        <w:t xml:space="preserve"> </w:t>
-      </w:r>
-      <w:r>
-        <w:rPr>
-          <w:b/>
-          <w:bCs/>
-        </w:rPr>
-        <w:t xml:space="preserve">disconnected feasible action</w:t>
-      </w:r>
-      <w:r>
-        <w:rPr>
-          <w:b/>
-          <w:bCs/>
-        </w:rPr>
-        <w:t xml:space="preserve"> </w:t>
-      </w:r>
-      <w:r>
-        <w:rPr>
-          <w:b/>
-          <w:bCs/>
-        </w:rPr>
-        <w:t xml:space="preserve">set</w:t>
-      </w:r>
-      <w:r>
-        <w:t xml:space="preserve"> </w:t>
-      </w:r>
-      <m:oMath>
-        <m:r>
-          <m:rPr>
-            <m:sty m:val="p"/>
-          </m:rPr>
-          <m:t>{</m:t>
-        </m:r>
-        <m:r>
-          <m:t>1</m:t>
-        </m:r>
-        <m:r>
-          <m:rPr>
-            <m:sty m:val="p"/>
-          </m:rPr>
-          <m:t>}</m:t>
-        </m:r>
-        <m:r>
-          <m:rPr>
-            <m:sty m:val="p"/>
-          </m:rPr>
-          <m:t>∪</m:t>
-        </m:r>
-        <m:r>
-          <m:rPr>
-            <m:sty m:val="p"/>
-          </m:rPr>
-          <m:t>[</m:t>
-        </m:r>
-        <m:sSub>
-          <m:e>
-            <m:r>
-              <m:t>α</m:t>
-            </m:r>
-          </m:e>
-          <m:sub>
-            <m:r>
-              <m:rPr>
-                <m:sty m:val="p"/>
-              </m:rPr>
-              <m:t>o</m:t>
-            </m:r>
-            <m:r>
-              <m:rPr>
-                <m:sty m:val="p"/>
-              </m:rPr>
-              <m:t>n</m:t>
-            </m:r>
-          </m:sub>
-        </m:sSub>
-        <m:r>
-          <m:rPr>
-            <m:sty m:val="p"/>
-          </m:rPr>
-          <m:t>(</m:t>
-        </m:r>
-        <m:r>
-          <m:t>s</m:t>
-        </m:r>
-        <m:r>
-          <m:rPr>
-            <m:sty m:val="p"/>
-          </m:rPr>
-          <m:t>)</m:t>
-        </m:r>
-        <m:r>
-          <m:rPr>
-            <m:sty m:val="p"/>
-          </m:rPr>
-          <m:t>,</m:t>
-        </m:r>
-        <m:r>
-          <m:t>2</m:t>
-        </m:r>
-        <m:r>
-          <m:rPr>
-            <m:sty m:val="p"/>
-          </m:rPr>
-          <m:t>]</m:t>
-        </m:r>
-      </m:oMath>
-      <w:r>
-        <w:t xml:space="preserve"> </w:t>
-      </w:r>
-      <w:r>
-        <w:t xml:space="preserve">on the</w:t>
-      </w:r>
-      <w:r>
-        <w:t xml:space="preserve"> </w:t>
-      </w:r>
-      <m:oMath>
-        <m:r>
-          <m:t>α</m:t>
-        </m:r>
-      </m:oMath>
-      <w:r>
-        <w:t xml:space="preserve"> </w:t>
-      </w:r>
-      <w:r>
-        <w:t xml:space="preserve">axis, with the dead band</w:t>
-      </w:r>
-      <w:r>
-        <w:t xml:space="preserve"> </w:t>
-      </w:r>
-      <m:oMath>
-        <m:r>
-          <m:rPr>
-            <m:sty m:val="p"/>
-          </m:rPr>
-          <m:t>(</m:t>
-        </m:r>
-        <m:r>
-          <m:t>1</m:t>
-        </m:r>
-        <m:r>
-          <m:rPr>
-            <m:sty m:val="p"/>
-          </m:rPr>
-          <m:t>,</m:t>
-        </m:r>
-        <m:sSub>
-          <m:e>
-            <m:r>
-              <m:t>α</m:t>
-            </m:r>
-          </m:e>
-          <m:sub>
-            <m:r>
-              <m:rPr>
-                <m:sty m:val="p"/>
-              </m:rPr>
-              <m:t>o</m:t>
-            </m:r>
-            <m:r>
-              <m:rPr>
-                <m:sty m:val="p"/>
-              </m:rPr>
-              <m:t>n</m:t>
-            </m:r>
-          </m:sub>
-        </m:sSub>
-        <m:r>
-          <m:rPr>
-            <m:sty m:val="p"/>
-          </m:rPr>
-          <m:t>(</m:t>
-        </m:r>
-        <m:r>
-          <m:t>s</m:t>
-        </m:r>
-        <m:r>
-          <m:rPr>
-            <m:sty m:val="p"/>
-          </m:rPr>
-          <m:t>)</m:t>
-        </m:r>
-        <m:r>
-          <m:rPr>
-            <m:sty m:val="p"/>
-          </m:rPr>
-          <m:t>)</m:t>
-        </m:r>
-      </m:oMath>
-      <w:r>
-        <w:t xml:space="preserve"> </w:t>
-      </w:r>
-      <w:r>
-        <w:t xml:space="preserve">marked, and an arrow showing the realization map (a command in the</w:t>
-      </w:r>
-      <w:r>
-        <w:t xml:space="preserve"> </w:t>
-      </w:r>
-      <w:r>
-        <w:t xml:space="preserve">dead band → OFF).</w:t>
-      </w:r>
-      <w:r>
-        <w:t xml:space="preserve"> </w:t>
-      </w:r>
-      <w:r>
-        <w:rPr>
-          <w:i/>
-          <w:iCs/>
-        </w:rPr>
-        <w:t xml:space="preserve">(Generate from</w:t>
-      </w:r>
-      <w:r>
-        <w:rPr>
-          <w:i/>
-          <w:iCs/>
-        </w:rPr>
-        <w:t xml:space="preserve"> </w:t>
-      </w:r>
-      <w:r>
-        <w:rPr>
-          <w:rStyle w:val="VerbatimChar"/>
-          <w:i/>
-          <w:iCs/>
-        </w:rPr>
-        <w:t xml:space="preserve">envs/compressor.py</w:t>
-      </w:r>
-      <w:r>
-        <w:rPr>
-          <w:i/>
-          <w:iCs/>
-        </w:rPr>
-        <w:t xml:space="preserve"> </w:t>
-      </w:r>
-      <w:r>
-        <w:rPr>
-          <w:i/>
-          <w:iCs/>
-        </w:rPr>
-        <w:t xml:space="preserve">by sweeping</w:t>
-      </w:r>
-      <w:r>
-        <w:rPr>
-          <w:i/>
-          <w:iCs/>
-        </w:rPr>
-        <w:t xml:space="preserve"> </w:t>
-      </w:r>
-      <m:oMath>
-        <m:r>
-          <m:t>α</m:t>
-        </m:r>
-      </m:oMath>
-      <w:r>
-        <w:rPr>
-          <w:i/>
-          <w:iCs/>
-        </w:rPr>
-        <w:t xml:space="preserve"> </w:t>
-      </w:r>
-      <w:r>
-        <w:rPr>
-          <w:i/>
-          <w:iCs/>
-        </w:rPr>
-        <w:t xml:space="preserve">at a representative</w:t>
-      </w:r>
-      <w:r>
-        <w:rPr>
-          <w:i/>
-          <w:iCs/>
-        </w:rPr>
-        <w:t xml:space="preserve"> </w:t>
-      </w:r>
-      <w:r>
-        <w:rPr>
-          <w:i/>
-          <w:iCs/>
-        </w:rPr>
-        <w:t xml:space="preserve">state; cf. the validation probe used in development.)</w:t>
-      </w:r>
-    </w:p>
-    <w:p>
-      <w:pPr>
-        <w:pStyle w:val="FirstParagraph"/>
+        <w:pStyle w:val="CaptionedFigure"/>
+      </w:pPr>
+      <w:r>
+        <w:drawing>
+          <wp:inline>
+            <wp:extent cx="5334000" cy="2092468"/>
+            <wp:effectExtent b="0" l="0" r="0" t="0"/>
+            <wp:docPr descr="Figure 2. Compressor feasible set. (a) Efficiency characteristic η(φ) with the feasible surge/choke band [φ_lo, φ_hi] shaded; (b) the realized discharge ratio (Eq. 5): a command in the sub-minimum-speed dead band (1, α_on≈1.29) is realized as unit-off, giving the disconnected feasible set {1}∪[α_on, 2]. Computed from envs/compressor.py at p₂=100." title="" id="24" name="Picture"/>
+            <a:graphic>
+              <a:graphicData uri="http://schemas.openxmlformats.org/drawingml/2006/picture">
+                <pic:pic>
+                  <pic:nvPicPr>
+                    <pic:cNvPr descr="fig2_compressor.png" id="25" name="Picture"/>
+                    <pic:cNvPicPr>
+                      <a:picLocks noChangeArrowheads="1" noChangeAspect="1"/>
+                    </pic:cNvPicPr>
+                  </pic:nvPicPr>
+                  <pic:blipFill>
+                    <a:blip r:embed="rId23"/>
+                    <a:stretch>
+                      <a:fillRect/>
+                    </a:stretch>
+                  </pic:blipFill>
+                  <pic:spPr bwMode="auto">
+                    <a:xfrm>
+                      <a:off x="0" y="0"/>
+                      <a:ext cx="5334000" cy="2092468"/>
+                    </a:xfrm>
+                    <a:prstGeom prst="rect">
+                      <a:avLst/>
+                    </a:prstGeom>
+                    <a:noFill/>
+                    <a:ln w="9525">
+                      <a:noFill/>
+                      <a:headEnd/>
+                      <a:tailEnd/>
+                    </a:ln>
+                  </pic:spPr>
+                </pic:pic>
+              </a:graphicData>
+            </a:graphic>
+          </wp:inline>
+        </w:drawing>
+      </w:r>
+    </w:p>
+    <w:p>
+      <w:pPr>
+        <w:pStyle w:val="ImageCaption"/>
+      </w:pPr>
+      <w:r>
+        <w:t xml:space="preserve">Figure 2. Compressor feasible set. (a) Efficiency characteristic η(φ) with the feasible surge/choke band [φ_lo, φ_hi] shaded; (b) the realized discharge ratio (Eq. 5): a command in the sub-minimum-speed dead band (1, α_on≈1.29) is realized as unit-off, giving the disconnected feasible set {1}∪[α_on, 2]. Computed from envs/compressor.py at p₂=100.</w:t>
+      </w:r>
+    </w:p>
+    <w:p>
+      <w:pPr>
+        <w:pStyle w:val="BodyText"/>
       </w:pPr>
       <w:r>
         <w:rPr>
@@ -4881,8 +4453,8 @@
         <w:t xml:space="preserve">fact also improves the GA).</w:t>
       </w:r>
     </w:p>
-    <w:bookmarkEnd w:id="20"/>
-    <w:bookmarkStart w:id="21" w:name="dynamic-line-pack-and-tou-economics"/>
+    <w:bookmarkEnd w:id="26"/>
+    <w:bookmarkStart w:id="27" w:name="dynamic-line-pack-and-tou-economics"/>
     <w:p>
       <w:pPr>
         <w:pStyle w:val="Heading3"/>
@@ -5426,8 +4998,8 @@
         <w:t xml:space="preserve">end-of-day inventory depletion.</w:t>
       </w:r>
     </w:p>
-    <w:bookmarkEnd w:id="21"/>
-    <w:bookmarkStart w:id="22" w:name="constrained-mdp"/>
+    <w:bookmarkEnd w:id="27"/>
+    <w:bookmarkStart w:id="28" w:name="constrained-mdp"/>
     <w:p>
       <w:pPr>
         <w:pStyle w:val="Heading3"/>
@@ -5920,9 +5492,9 @@
         </w:pict>
       </w:r>
     </w:p>
-    <w:bookmarkEnd w:id="22"/>
-    <w:bookmarkEnd w:id="23"/>
-    <w:bookmarkStart w:id="28" w:name="method"/>
+    <w:bookmarkEnd w:id="28"/>
+    <w:bookmarkEnd w:id="29"/>
+    <w:bookmarkStart w:id="37" w:name="method"/>
     <w:p>
       <w:pPr>
         <w:pStyle w:val="Heading2"/>
@@ -5933,64 +5505,60 @@
     </w:p>
     <w:p>
       <w:pPr>
-        <w:pStyle w:val="BlockText"/>
-      </w:pPr>
-      <w:r>
-        <w:t xml:space="preserve">🖼️</w:t>
-      </w:r>
-      <w:r>
-        <w:t xml:space="preserve"> </w:t>
-      </w:r>
-      <w:r>
-        <w:rPr>
-          <w:b/>
-          <w:bCs/>
-        </w:rPr>
-        <w:t xml:space="preserve">[INSERT FIGURE 3 — Method overview.]</w:t>
-      </w:r>
-      <w:r>
-        <w:t xml:space="preserve"> </w:t>
-      </w:r>
-      <w:r>
-        <w:t xml:space="preserve">A schematic of the pipeline: (a) the CMDP</w:t>
-      </w:r>
-      <w:r>
-        <w:t xml:space="preserve"> </w:t>
-      </w:r>
-      <w:r>
-        <w:t xml:space="preserve">agent–environment loop (state → policy → discharge ratio → feasibility realization Eq. (5) →</w:t>
-      </w:r>
-      <w:r>
-        <w:t xml:space="preserve"> </w:t>
-      </w:r>
-      <w:r>
-        <w:t xml:space="preserve">dynamic line-pack Eq. (6) → economic reward Eq. (7) + constraint cost); (b) Constrained-SAC with</w:t>
-      </w:r>
-      <w:r>
-        <w:t xml:space="preserve"> </w:t>
-      </w:r>
-      <w:r>
-        <w:t xml:space="preserve">the dual-ascent update Eq. (10) on</w:t>
-      </w:r>
-      <w:r>
-        <w:t xml:space="preserve"> </w:t>
-      </w:r>
-      <m:oMath>
-        <m:r>
-          <m:t>λ</m:t>
-        </m:r>
-      </m:oMath>
-      <w:r>
-        <w:t xml:space="preserve">; (c) the MPC-distillation pipeline (DP/MPC teacher →</w:t>
-      </w:r>
-      <w:r>
-        <w:t xml:space="preserve"> </w:t>
-      </w:r>
-      <w:r>
-        <w:t xml:space="preserve">DAgger relabelling → millisecond student). One column per stage.</w:t>
-      </w:r>
-    </w:p>
-    <w:bookmarkStart w:id="24" w:name="constrained-lagrangian-sac"/>
+        <w:pStyle w:val="CaptionedFigure"/>
+      </w:pPr>
+      <w:r>
+        <w:drawing>
+          <wp:inline>
+            <wp:extent cx="5334000" cy="1903505"/>
+            <wp:effectExtent b="0" l="0" r="0" t="0"/>
+            <wp:docPr descr="Figure 3. Method overview: (a) the dynamic CMDP environment loop (state → policy → discharge ratio → feasibility realization Eq. 5 → Weymouth flow + line-pack Eq. 6 → economic reward Eq. 7 and constraint cost); (b) Constrained-SAC optimizing r_econ − λc with dual ascent on λ (Eqs. 9–10); (c) the MPC-distillation pipeline (DP/MPC teacher → DAgger → millisecond student policy)." title="" id="31" name="Picture"/>
+            <a:graphic>
+              <a:graphicData uri="http://schemas.openxmlformats.org/drawingml/2006/picture">
+                <pic:pic>
+                  <pic:nvPicPr>
+                    <pic:cNvPr descr="fig3_method.png" id="32" name="Picture"/>
+                    <pic:cNvPicPr>
+                      <a:picLocks noChangeArrowheads="1" noChangeAspect="1"/>
+                    </pic:cNvPicPr>
+                  </pic:nvPicPr>
+                  <pic:blipFill>
+                    <a:blip r:embed="rId30"/>
+                    <a:stretch>
+                      <a:fillRect/>
+                    </a:stretch>
+                  </pic:blipFill>
+                  <pic:spPr bwMode="auto">
+                    <a:xfrm>
+                      <a:off x="0" y="0"/>
+                      <a:ext cx="5334000" cy="1903505"/>
+                    </a:xfrm>
+                    <a:prstGeom prst="rect">
+                      <a:avLst/>
+                    </a:prstGeom>
+                    <a:noFill/>
+                    <a:ln w="9525">
+                      <a:noFill/>
+                      <a:headEnd/>
+                      <a:tailEnd/>
+                    </a:ln>
+                  </pic:spPr>
+                </pic:pic>
+              </a:graphicData>
+            </a:graphic>
+          </wp:inline>
+        </w:drawing>
+      </w:r>
+    </w:p>
+    <w:p>
+      <w:pPr>
+        <w:pStyle w:val="ImageCaption"/>
+      </w:pPr>
+      <w:r>
+        <w:t xml:space="preserve">Figure 3. Method overview: (a) the dynamic CMDP environment loop (state → policy → discharge ratio → feasibility realization Eq. 5 → Weymouth flow + line-pack Eq. 6 → economic reward Eq. 7 and constraint cost); (b) Constrained-SAC optimizing r_econ − λc with dual ascent on λ (Eqs. 9–10); (c) the MPC-distillation pipeline (DP/MPC teacher → DAgger → millisecond student policy).</w:t>
+      </w:r>
+    </w:p>
+    <w:bookmarkStart w:id="33" w:name="constrained-lagrangian-sac"/>
     <w:p>
       <w:pPr>
         <w:pStyle w:val="Heading3"/>
@@ -6643,8 +6211,8 @@
         <w:t xml:space="preserve">(128–64–32), matching [1].</w:t>
       </w:r>
     </w:p>
-    <w:bookmarkEnd w:id="24"/>
-    <w:bookmarkStart w:id="25" w:name="distilling-mpc-into-a-millisecond-policy"/>
+    <w:bookmarkEnd w:id="33"/>
+    <w:bookmarkStart w:id="34" w:name="distilling-mpc-into-a-millisecond-policy"/>
     <w:p>
       <w:pPr>
         <w:pStyle w:val="Heading3"/>
@@ -6754,8 +6322,8 @@
         <w:t xml:space="preserve">is cheap (seconds–minutes); it inherits the teacher’s feasibility while shedding its online cost.</w:t>
       </w:r>
     </w:p>
-    <w:bookmarkEnd w:id="25"/>
-    <w:bookmarkStart w:id="26" w:name="baselines"/>
+    <w:bookmarkEnd w:id="34"/>
+    <w:bookmarkStart w:id="35" w:name="baselines"/>
     <w:p>
       <w:pPr>
         <w:pStyle w:val="Heading3"/>
@@ -7007,8 +6575,8 @@
         <w:t xml:space="preserve">SAC, TD3, PPO (penalty reward) and Constrained-SAC, identical architecture/budget.</w:t>
       </w:r>
     </w:p>
-    <w:bookmarkEnd w:id="26"/>
-    <w:bookmarkStart w:id="27" w:name="fairness-and-reproducibility"/>
+    <w:bookmarkEnd w:id="35"/>
+    <w:bookmarkStart w:id="36" w:name="fairness-and-reproducibility"/>
     <w:p>
       <w:pPr>
         <w:pStyle w:val="Heading3"/>
@@ -7050,9 +6618,9 @@
         </w:pict>
       </w:r>
     </w:p>
-    <w:bookmarkEnd w:id="27"/>
-    <w:bookmarkEnd w:id="28"/>
-    <w:bookmarkStart w:id="29" w:name="experimental-setup"/>
+    <w:bookmarkEnd w:id="36"/>
+    <w:bookmarkEnd w:id="37"/>
+    <w:bookmarkStart w:id="38" w:name="experimental-setup"/>
     <w:p>
       <w:pPr>
         <w:pStyle w:val="Heading2"/>
@@ -8087,8 +7655,8 @@
         </w:pict>
       </w:r>
     </w:p>
-    <w:bookmarkEnd w:id="29"/>
-    <w:bookmarkStart w:id="57" w:name="results"/>
+    <w:bookmarkEnd w:id="38"/>
+    <w:bookmarkStart w:id="66" w:name="results"/>
     <w:p>
       <w:pPr>
         <w:pStyle w:val="Heading2"/>
@@ -8180,7 +7748,7 @@
         <w:t xml:space="preserve">GA = full optimisation).</w:t>
       </w:r>
     </w:p>
-    <w:bookmarkStart w:id="30" w:name="X1e41505dc6f4876017d5f79af93284ade562b50"/>
+    <w:bookmarkStart w:id="39" w:name="X1e41505dc6f4876017d5f79af93284ade562b50"/>
     <w:p>
       <w:pPr>
         <w:pStyle w:val="Heading3"/>
@@ -8322,8 +7890,8 @@
         <w:t xml:space="preserve">feasible cost drops by ~4×).</w:t>
       </w:r>
     </w:p>
-    <w:bookmarkEnd w:id="30"/>
-    <w:bookmarkStart w:id="34" w:name="nominal-and-robust-performance-table-1"/>
+    <w:bookmarkEnd w:id="39"/>
+    <w:bookmarkStart w:id="43" w:name="nominal-and-robust-performance-table-1"/>
     <w:p>
       <w:pPr>
         <w:pStyle w:val="Heading3"/>
@@ -9248,18 +8816,18 @@
           <wp:inline>
             <wp:extent cx="5334000" cy="2963333"/>
             <wp:effectExtent b="0" l="0" r="0" t="0"/>
-            <wp:docPr descr="Figure 4. Nominal 24-h electricity cost by method on the gun-barrel network (mean ± std over seeds); annotations show mean violation-hours." title="" id="32" name="Picture"/>
+            <wp:docPr descr="Figure 4. Nominal 24-h electricity cost by method on the gun-barrel network (mean ± std over seeds); annotations show mean violation-hours." title="" id="41" name="Picture"/>
             <a:graphic>
               <a:graphicData uri="http://schemas.openxmlformats.org/drawingml/2006/picture">
                 <pic:pic>
                   <pic:nvPicPr>
-                    <pic:cNvPr descr="../models/exports/paper/fig_cost_nominal.png" id="33" name="Picture"/>
+                    <pic:cNvPr descr="../models/exports/paper/fig_cost_nominal.png" id="42" name="Picture"/>
                     <pic:cNvPicPr>
                       <a:picLocks noChangeArrowheads="1" noChangeAspect="1"/>
                     </pic:cNvPicPr>
                   </pic:nvPicPr>
                   <pic:blipFill>
-                    <a:blip r:embed="rId31"/>
+                    <a:blip r:embed="rId40"/>
                     <a:stretch>
                       <a:fillRect/>
                     </a:stretch>
@@ -9538,8 +9106,8 @@
         <w:t xml:space="preserve">it could not when the base problem was infeasible (cf. our earlier negative result).</w:t>
       </w:r>
     </w:p>
-    <w:bookmarkEnd w:id="34"/>
-    <w:bookmarkStart w:id="35" w:name="X18395e5fe9119e7b21efafd33aacbd1e6fe5d48"/>
+    <w:bookmarkEnd w:id="43"/>
+    <w:bookmarkStart w:id="44" w:name="X18395e5fe9119e7b21efafd33aacbd1e6fe5d48"/>
     <w:p>
       <w:pPr>
         <w:pStyle w:val="Heading3"/>
@@ -9681,8 +9249,8 @@
         <w:t xml:space="preserve">combines MPC-level cost and feasibility with DRL-level (≈200×) deployment latency.</w:t>
       </w:r>
     </w:p>
-    <w:bookmarkEnd w:id="35"/>
-    <w:bookmarkStart w:id="36" w:name="deployment-latency-table-1-last-column"/>
+    <w:bookmarkEnd w:id="44"/>
+    <w:bookmarkStart w:id="45" w:name="deployment-latency-table-1-last-column"/>
     <w:p>
       <w:pPr>
         <w:pStyle w:val="Heading3"/>
@@ -9837,8 +9405,8 @@
         <w:t xml:space="preserve">feasibility (though not yet with cost-optimality).</w:t>
       </w:r>
     </w:p>
-    <w:bookmarkEnd w:id="36"/>
-    <w:bookmarkStart w:id="40" w:name="dispatch-behaviour-fig.-5"/>
+    <w:bookmarkEnd w:id="45"/>
+    <w:bookmarkStart w:id="49" w:name="dispatch-behaviour-fig.-5"/>
     <w:p>
       <w:pPr>
         <w:pStyle w:val="Heading3"/>
@@ -9856,18 +9424,18 @@
           <wp:inline>
             <wp:extent cx="5334000" cy="3556000"/>
             <wp:effectExtent b="0" l="0" r="0" t="0"/>
-            <wp:docPr descr="Figure 5. Deterministic 24-h dispatch on the gun-barrel network — Distilled-MPC, Constrained-SAC, DP-oracle and MPC. Distilled-MPC tracks DP/MPC at low cumulative cost; Constrained-SAC keeps a larger pressure margin and sits above (the from-scratch premium)." title="" id="38" name="Picture"/>
+            <wp:docPr descr="Figure 5. Deterministic 24-h dispatch on the gun-barrel network — Distilled-MPC, Constrained-SAC, DP-oracle and MPC. Distilled-MPC tracks DP/MPC at low cumulative cost; Constrained-SAC keeps a larger pressure margin and sits above (the from-scratch premium)." title="" id="47" name="Picture"/>
             <a:graphic>
               <a:graphicData uri="http://schemas.openxmlformats.org/drawingml/2006/picture">
                 <pic:pic>
                   <pic:nvPicPr>
-                    <pic:cNvPr descr="../models/exports/paper/fig_dispatch.png" id="39" name="Picture"/>
+                    <pic:cNvPr descr="../models/exports/paper/fig_dispatch.png" id="48" name="Picture"/>
                     <pic:cNvPicPr>
                       <a:picLocks noChangeArrowheads="1" noChangeAspect="1"/>
                     </pic:cNvPicPr>
                   </pic:nvPicPr>
                   <pic:blipFill>
-                    <a:blip r:embed="rId37"/>
+                    <a:blip r:embed="rId46"/>
                     <a:stretch>
                       <a:fillRect/>
                     </a:stretch>
@@ -9959,8 +9527,8 @@
         <w:t xml:space="preserve">premium) on the same qualitative shape.</w:t>
       </w:r>
     </w:p>
-    <w:bookmarkEnd w:id="40"/>
-    <w:bookmarkStart w:id="44" w:name="robustness-fig.-6"/>
+    <w:bookmarkEnd w:id="49"/>
+    <w:bookmarkStart w:id="53" w:name="robustness-fig.-6"/>
     <w:p>
       <w:pPr>
         <w:pStyle w:val="Heading3"/>
@@ -9978,18 +9546,18 @@
           <wp:inline>
             <wp:extent cx="5334000" cy="2963333"/>
             <wp:effectExtent b="0" l="0" r="0" t="0"/>
-            <wp:docPr descr="Figure 6. Cost (mean ± std) under perturbed demand/price on the gun-barrel network; annotations show mean violation-hours." title="" id="42" name="Picture"/>
+            <wp:docPr descr="Figure 6. Cost (mean ± std) under perturbed demand/price on the gun-barrel network; annotations show mean violation-hours." title="" id="51" name="Picture"/>
             <a:graphic>
               <a:graphicData uri="http://schemas.openxmlformats.org/drawingml/2006/picture">
                 <pic:pic>
                   <pic:nvPicPr>
-                    <pic:cNvPr descr="../models/exports/paper/fig_robustness.png" id="43" name="Picture"/>
+                    <pic:cNvPr descr="../models/exports/paper/fig_robustness.png" id="52" name="Picture"/>
                     <pic:cNvPicPr>
                       <a:picLocks noChangeArrowheads="1" noChangeAspect="1"/>
                     </pic:cNvPicPr>
                   </pic:nvPicPr>
                   <pic:blipFill>
-                    <a:blip r:embed="rId41"/>
+                    <a:blip r:embed="rId50"/>
                     <a:stretch>
                       <a:fillRect/>
                     </a:stretch>
@@ -10112,8 +9680,8 @@
         <w:t xml:space="preserve">millisecond latency with no online solver.</w:t>
       </w:r>
     </w:p>
-    <w:bookmarkEnd w:id="44"/>
-    <w:bookmarkStart w:id="45" w:name="ablations-table-1b"/>
+    <w:bookmarkEnd w:id="53"/>
+    <w:bookmarkStart w:id="54" w:name="ablations-table-1b"/>
     <w:p>
       <w:pPr>
         <w:pStyle w:val="Heading3"/>
@@ -10655,8 +10223,8 @@
         <w:t xml:space="preserve">, not hand-tuned weights, is doing the work — the method’s central claim.</w:t>
       </w:r>
     </w:p>
-    <w:bookmarkEnd w:id="45"/>
-    <w:bookmarkStart w:id="52" w:name="X126fffdc255fc9bd938151f9e29fcc7fade49ce"/>
+    <w:bookmarkEnd w:id="54"/>
+    <w:bookmarkStart w:id="61" w:name="X126fffdc255fc9bd938151f9e29fcc7fade49ce"/>
     <w:p>
       <w:pPr>
         <w:pStyle w:val="Heading3"/>
@@ -12042,18 +11610,18 @@
           <wp:inline>
             <wp:extent cx="5334000" cy="2963333"/>
             <wp:effectExtent b="0" l="0" r="0" t="0"/>
-            <wp:docPr descr="Figure 7. Branched benchmark — nominal cost by method (left) and 24-h dispatch curves (right). The feasibility-aware DRL agents stay in-band; SAC is cost-competitive with the GA optimum." title="" id="47" name="Picture"/>
+            <wp:docPr descr="Figure 7. Branched benchmark — nominal cost by method (left) and 24-h dispatch curves (right). The feasibility-aware DRL agents stay in-band; SAC is cost-competitive with the GA optimum." title="" id="56" name="Picture"/>
             <a:graphic>
               <a:graphicData uri="http://schemas.openxmlformats.org/drawingml/2006/picture">
                 <pic:pic>
                   <pic:nvPicPr>
-                    <pic:cNvPr descr="../models/exports/paper_branched/fig_cost_nominal.png" id="48" name="Picture"/>
+                    <pic:cNvPr descr="../models/exports/paper_branched/fig_cost_nominal.png" id="57" name="Picture"/>
                     <pic:cNvPicPr>
                       <a:picLocks noChangeArrowheads="1" noChangeAspect="1"/>
                     </pic:cNvPicPr>
                   </pic:nvPicPr>
                   <pic:blipFill>
-                    <a:blip r:embed="rId46"/>
+                    <a:blip r:embed="rId55"/>
                     <a:stretch>
                       <a:fillRect/>
                     </a:stretch>
@@ -12097,18 +11665,18 @@
           <wp:inline>
             <wp:extent cx="5334000" cy="2963333"/>
             <wp:effectExtent b="0" l="0" r="0" t="0"/>
-            <wp:docPr descr="Figure 8. Branched benchmark — robustness (cost mean ± std and violation-hours) under perturbed demand/price." title="" id="50" name="Picture"/>
+            <wp:docPr descr="Figure 8. Branched benchmark — robustness (cost mean ± std and violation-hours) under perturbed demand/price." title="" id="59" name="Picture"/>
             <a:graphic>
               <a:graphicData uri="http://schemas.openxmlformats.org/drawingml/2006/picture">
                 <pic:pic>
                   <pic:nvPicPr>
-                    <pic:cNvPr descr="../models/exports/paper_branched/fig_robustness.png" id="51" name="Picture"/>
+                    <pic:cNvPr descr="../models/exports/paper_branched/fig_robustness.png" id="60" name="Picture"/>
                     <pic:cNvPicPr>
                       <a:picLocks noChangeArrowheads="1" noChangeAspect="1"/>
                     </pic:cNvPicPr>
                   </pic:nvPicPr>
                   <pic:blipFill>
-                    <a:blip r:embed="rId49"/>
+                    <a:blip r:embed="rId58"/>
                     <a:stretch>
                       <a:fillRect/>
                     </a:stretch>
@@ -12163,8 +11731,8 @@
         <w:t xml:space="preserve">the constraint-aware-SAC ranking and the grid-DP reference are the network-dependent caveats.</w:t>
       </w:r>
     </w:p>
-    <w:bookmarkEnd w:id="52"/>
-    <w:bookmarkStart w:id="56" w:name="Xd3ca94ac4eba9be6722f26c7cab872a57fb4a24"/>
+    <w:bookmarkEnd w:id="61"/>
+    <w:bookmarkStart w:id="65" w:name="Xd3ca94ac4eba9be6722f26c7cab872a57fb4a24"/>
     <w:p>
       <w:pPr>
         <w:pStyle w:val="Heading3"/>
@@ -13377,18 +12945,18 @@
           <wp:inline>
             <wp:extent cx="5334000" cy="2963333"/>
             <wp:effectExtent b="0" l="0" r="0" t="0"/>
-            <wp:docPr descr="Figure 9. GasLib-40-derived network — nominal cost by method (left) and 24-h dispatch (right)." title="" id="54" name="Picture"/>
+            <wp:docPr descr="Figure 9. GasLib-40-derived network — nominal cost by method (left) and 24-h dispatch (right)." title="" id="63" name="Picture"/>
             <a:graphic>
               <a:graphicData uri="http://schemas.openxmlformats.org/drawingml/2006/picture">
                 <pic:pic>
                   <pic:nvPicPr>
-                    <pic:cNvPr descr="../models/exports/paper_gaslib/fig_cost_nominal.png" id="55" name="Picture"/>
+                    <pic:cNvPr descr="../models/exports/paper_gaslib/fig_cost_nominal.png" id="64" name="Picture"/>
                     <pic:cNvPicPr>
                       <a:picLocks noChangeArrowheads="1" noChangeAspect="1"/>
                     </pic:cNvPicPr>
                   </pic:nvPicPr>
                   <pic:blipFill>
-                    <a:blip r:embed="rId53"/>
+                    <a:blip r:embed="rId62"/>
                     <a:stretch>
                       <a:fillRect/>
                     </a:stretch>
@@ -13430,9 +12998,9 @@
         </w:pict>
       </w:r>
     </w:p>
-    <w:bookmarkEnd w:id="56"/>
-    <w:bookmarkEnd w:id="57"/>
-    <w:bookmarkStart w:id="58" w:name="discussion-and-limitations"/>
+    <w:bookmarkEnd w:id="65"/>
+    <w:bookmarkEnd w:id="66"/>
+    <w:bookmarkStart w:id="67" w:name="discussion-and-limitations"/>
     <w:p>
       <w:pPr>
         <w:pStyle w:val="Heading2"/>
@@ -13939,8 +13507,8 @@
         </w:pict>
       </w:r>
     </w:p>
-    <w:bookmarkEnd w:id="58"/>
-    <w:bookmarkStart w:id="59" w:name="conclusion"/>
+    <w:bookmarkEnd w:id="67"/>
+    <w:bookmarkStart w:id="68" w:name="conclusion"/>
     <w:p>
       <w:pPr>
         <w:pStyle w:val="Heading2"/>
@@ -14171,8 +13739,8 @@
         </w:pict>
       </w:r>
     </w:p>
-    <w:bookmarkEnd w:id="59"/>
-    <w:bookmarkStart w:id="60" w:name="references"/>
+    <w:bookmarkEnd w:id="68"/>
+    <w:bookmarkStart w:id="69" w:name="references"/>
     <w:p>
       <w:pPr>
         <w:pStyle w:val="Heading2"/>
@@ -15750,8 +15318,8 @@
         <w:t xml:space="preserve">, 52:90–99, 2013.</w:t>
       </w:r>
     </w:p>
-    <w:bookmarkEnd w:id="60"/>
-    <w:bookmarkEnd w:id="61"/>
+    <w:bookmarkEnd w:id="69"/>
+    <w:bookmarkEnd w:id="70"/>
     <w:sectPr>
       <w:footnotePr>
         <w:numRestart w:val="eachSect"/>

</xml_diff>

<commit_message>
Add Group-A analysis figures (ablation, cost-latency Pareto, cross-network) + fix Fig captions
- paper/make_analysis_figures.py: generate three figures from the saved CSVs (no retraining):
  fig_ablation (Table 1b visualised), fig_cost_latency (cost-vs-latency Pareto on gun-barrel,
  Distilled-MPC in the ideal lower-left corner), fig_summary_networks (cost ×DP-optimum across
  the three networks).
- Embed them: ablation as Fig 7 in §6.7; new §6.10 "Summary" with the Pareto (Fig 11) and
  cross-network (Fig 12). Renumbered the branched/GasLib result figures to 8/9/10 and fixed the
  Fig 8/10 captions (removed the inaccurate "dispatch (right)" overclaim — those panels are cost only).
- Mirrored all changes into the Chinese draft. Regenerated both docx (12 figures each).

Co-Authored-By: Claude Opus 4.8 <noreply@anthropic.com>
</commit_message>
<xml_diff>
--- a/paper/draft.docx
+++ b/paper/draft.docx
@@ -36,7 +36,7 @@
         </w:p>
       </w:sdtContent>
     </w:sdt>
-    <w:bookmarkStart w:id="70" w:name="X08838f8191057507e4ebd8c290734ad44122935"/>
+    <w:bookmarkStart w:id="80" w:name="X08838f8191057507e4ebd8c290734ad44122935"/>
     <w:p>
       <w:pPr>
         <w:pStyle w:val="Heading1"/>
@@ -7656,7 +7656,7 @@
       </w:r>
     </w:p>
     <w:bookmarkEnd w:id="38"/>
-    <w:bookmarkStart w:id="66" w:name="results"/>
+    <w:bookmarkStart w:id="76" w:name="results"/>
     <w:p>
       <w:pPr>
         <w:pStyle w:val="Heading2"/>
@@ -9681,7 +9681,7 @@
       </w:r>
     </w:p>
     <w:bookmarkEnd w:id="53"/>
-    <w:bookmarkStart w:id="54" w:name="ablations-table-1b"/>
+    <w:bookmarkStart w:id="57" w:name="ablations-table-1b"/>
     <w:p>
       <w:pPr>
         <w:pStyle w:val="Heading3"/>
@@ -10031,6 +10031,61 @@
     </w:tbl>
     <w:p>
       <w:pPr>
+        <w:pStyle w:val="CaptionedFigure"/>
+      </w:pPr>
+      <w:r>
+        <w:drawing>
+          <wp:inline>
+            <wp:extent cx="5334000" cy="2115319"/>
+            <wp:effectExtent b="0" l="0" r="0" t="0"/>
+            <wp:docPr descr="Figure 7. Ablation on the gun-barrel network (Constrained-SAC, mean ± std over seeds). (a) 24-h cost with terminal-gap annotated; (b) constraint-violation hours. Removing the feasibility realization (red) breaks feasibility and doubles cost; removing the soft margin (green) recovers near-optimal cost at zero violations; zeroing the surge/terminal penalty weights has no effect (Constrained-SAC uses the unified constraint cost)." title="" id="55" name="Picture"/>
+            <a:graphic>
+              <a:graphicData uri="http://schemas.openxmlformats.org/drawingml/2006/picture">
+                <pic:pic>
+                  <pic:nvPicPr>
+                    <pic:cNvPr descr="fig_ablation.png" id="56" name="Picture"/>
+                    <pic:cNvPicPr>
+                      <a:picLocks noChangeArrowheads="1" noChangeAspect="1"/>
+                    </pic:cNvPicPr>
+                  </pic:nvPicPr>
+                  <pic:blipFill>
+                    <a:blip r:embed="rId54"/>
+                    <a:stretch>
+                      <a:fillRect/>
+                    </a:stretch>
+                  </pic:blipFill>
+                  <pic:spPr bwMode="auto">
+                    <a:xfrm>
+                      <a:off x="0" y="0"/>
+                      <a:ext cx="5334000" cy="2115319"/>
+                    </a:xfrm>
+                    <a:prstGeom prst="rect">
+                      <a:avLst/>
+                    </a:prstGeom>
+                    <a:noFill/>
+                    <a:ln w="9525">
+                      <a:noFill/>
+                      <a:headEnd/>
+                      <a:tailEnd/>
+                    </a:ln>
+                  </pic:spPr>
+                </pic:pic>
+              </a:graphicData>
+            </a:graphic>
+          </wp:inline>
+        </w:drawing>
+      </w:r>
+    </w:p>
+    <w:p>
+      <w:pPr>
+        <w:pStyle w:val="ImageCaption"/>
+      </w:pPr>
+      <w:r>
+        <w:t xml:space="preserve">Figure 7. Ablation on the gun-barrel network (Constrained-SAC, mean ± std over seeds). (a) 24-h cost with terminal-gap annotated; (b) constraint-violation hours. Removing the feasibility realization (red) breaks feasibility and doubles cost; removing the soft margin (green) recovers near-optimal cost at zero violations; zeroing the surge/terminal penalty weights has no effect (Constrained-SAC uses the unified constraint cost).</w:t>
+      </w:r>
+    </w:p>
+    <w:p>
+      <w:pPr>
         <w:pStyle w:val="BodyText"/>
       </w:pPr>
       <w:r>
@@ -10223,8 +10278,8 @@
         <w:t xml:space="preserve">, not hand-tuned weights, is doing the work — the method’s central claim.</w:t>
       </w:r>
     </w:p>
-    <w:bookmarkEnd w:id="54"/>
-    <w:bookmarkStart w:id="61" w:name="X126fffdc255fc9bd938151f9e29fcc7fade49ce"/>
+    <w:bookmarkEnd w:id="57"/>
+    <w:bookmarkStart w:id="64" w:name="X126fffdc255fc9bd938151f9e29fcc7fade49ce"/>
     <w:p>
       <w:pPr>
         <w:pStyle w:val="Heading3"/>
@@ -11610,67 +11665,12 @@
           <wp:inline>
             <wp:extent cx="5334000" cy="2963333"/>
             <wp:effectExtent b="0" l="0" r="0" t="0"/>
-            <wp:docPr descr="Figure 7. Branched benchmark — nominal cost by method (left) and 24-h dispatch curves (right). The feasibility-aware DRL agents stay in-band; SAC is cost-competitive with the GA optimum." title="" id="56" name="Picture"/>
+            <wp:docPr descr="Figure 8. Branched benchmark — nominal 24-h cost by method (mean ± std). The feasibility-aware DRL agents stay in-band; SAC is cost-competitive with the GA optimum." title="" id="59" name="Picture"/>
             <a:graphic>
               <a:graphicData uri="http://schemas.openxmlformats.org/drawingml/2006/picture">
                 <pic:pic>
                   <pic:nvPicPr>
-                    <pic:cNvPr descr="../models/exports/paper_branched/fig_cost_nominal.png" id="57" name="Picture"/>
-                    <pic:cNvPicPr>
-                      <a:picLocks noChangeArrowheads="1" noChangeAspect="1"/>
-                    </pic:cNvPicPr>
-                  </pic:nvPicPr>
-                  <pic:blipFill>
-                    <a:blip r:embed="rId55"/>
-                    <a:stretch>
-                      <a:fillRect/>
-                    </a:stretch>
-                  </pic:blipFill>
-                  <pic:spPr bwMode="auto">
-                    <a:xfrm>
-                      <a:off x="0" y="0"/>
-                      <a:ext cx="5334000" cy="2963333"/>
-                    </a:xfrm>
-                    <a:prstGeom prst="rect">
-                      <a:avLst/>
-                    </a:prstGeom>
-                    <a:noFill/>
-                    <a:ln w="9525">
-                      <a:noFill/>
-                      <a:headEnd/>
-                      <a:tailEnd/>
-                    </a:ln>
-                  </pic:spPr>
-                </pic:pic>
-              </a:graphicData>
-            </a:graphic>
-          </wp:inline>
-        </w:drawing>
-      </w:r>
-    </w:p>
-    <w:p>
-      <w:pPr>
-        <w:pStyle w:val="ImageCaption"/>
-      </w:pPr>
-      <w:r>
-        <w:t xml:space="preserve">Figure 7. Branched benchmark — nominal cost by method (left) and 24-h dispatch curves (right). The feasibility-aware DRL agents stay in-band; SAC is cost-competitive with the GA optimum.</w:t>
-      </w:r>
-    </w:p>
-    <w:p>
-      <w:pPr>
-        <w:pStyle w:val="CaptionedFigure"/>
-      </w:pPr>
-      <w:r>
-        <w:drawing>
-          <wp:inline>
-            <wp:extent cx="5334000" cy="2963333"/>
-            <wp:effectExtent b="0" l="0" r="0" t="0"/>
-            <wp:docPr descr="Figure 8. Branched benchmark — robustness (cost mean ± std and violation-hours) under perturbed demand/price." title="" id="59" name="Picture"/>
-            <a:graphic>
-              <a:graphicData uri="http://schemas.openxmlformats.org/drawingml/2006/picture">
-                <pic:pic>
-                  <pic:nvPicPr>
-                    <pic:cNvPr descr="../models/exports/paper_branched/fig_robustness.png" id="60" name="Picture"/>
+                    <pic:cNvPr descr="../models/exports/paper_branched/fig_cost_nominal.png" id="60" name="Picture"/>
                     <pic:cNvPicPr>
                       <a:picLocks noChangeArrowheads="1" noChangeAspect="1"/>
                     </pic:cNvPicPr>
@@ -11708,1232 +11708,7 @@
         <w:pStyle w:val="ImageCaption"/>
       </w:pPr>
       <w:r>
-        <w:t xml:space="preserve">Figure 8. Branched benchmark — robustness (cost mean ± std and violation-hours) under perturbed demand/price.</w:t>
-      </w:r>
-    </w:p>
-    <w:p>
-      <w:pPr>
-        <w:pStyle w:val="BodyText"/>
-      </w:pPr>
-      <w:r>
-        <w:t xml:space="preserve">Net: the methodological contributions — the feasibility-aware action realisation, feasible</w:t>
-      </w:r>
-      <w:r>
-        <w:t xml:space="preserve"> </w:t>
-      </w:r>
-      <w:r>
-        <w:t xml:space="preserve">from-scratch DRL, and MPC distillation — all transfer to the larger, parameter-realistic network;</w:t>
-      </w:r>
-      <w:r>
-        <w:t xml:space="preserve"> </w:t>
-      </w:r>
-      <w:r>
-        <w:t xml:space="preserve">the constraint-aware-SAC ranking and the grid-DP reference are the network-dependent caveats.</w:t>
-      </w:r>
-    </w:p>
-    <w:bookmarkEnd w:id="61"/>
-    <w:bookmarkStart w:id="65" w:name="Xd3ca94ac4eba9be6722f26c7cab872a57fb4a24"/>
-    <w:p>
-      <w:pPr>
-        <w:pStyle w:val="Heading3"/>
-      </w:pPr>
-      <w:r>
-        <w:t xml:space="preserve">6.9 Real-geometry network from GasLib-40 (Table 3)</w:t>
-      </w:r>
-    </w:p>
-    <w:p>
-      <w:pPr>
-        <w:pStyle w:val="FirstParagraph"/>
-      </w:pPr>
-      <w:r>
-        <w:t xml:space="preserve">To move beyond hand-set parameters we extract a sub-network from the</w:t>
-      </w:r>
-      <w:r>
-        <w:t xml:space="preserve"> </w:t>
-      </w:r>
-      <w:r>
-        <w:rPr>
-          <w:b/>
-          <w:bCs/>
-        </w:rPr>
-        <w:t xml:space="preserve">real GasLib-40 instance</w:t>
-      </w:r>
-      <w:r>
-        <w:t xml:space="preserve"> </w:t>
-      </w:r>
-      <w:r>
-        <w:t xml:space="preserve">(a model of the German low-calorific transmission grid): the line from the compressor-station node</w:t>
-      </w:r>
-      <w:r>
-        <w:t xml:space="preserve"> </w:t>
-      </w:r>
-      <w:r>
-        <w:rPr>
-          <w:rStyle w:val="VerbatimChar"/>
-        </w:rPr>
-        <w:t xml:space="preserve">innode_6</w:t>
-      </w:r>
-      <w:r>
-        <w:t xml:space="preserve"> </w:t>
-      </w:r>
-      <w:r>
-        <w:t xml:space="preserve">through the demand chain</w:t>
-      </w:r>
-      <w:r>
-        <w:t xml:space="preserve"> </w:t>
-      </w:r>
-      <w:r>
-        <w:rPr>
-          <w:rStyle w:val="VerbatimChar"/>
-        </w:rPr>
-        <w:t xml:space="preserve">sink_13 → sink_14 → sink_10</w:t>
-      </w:r>
-      <w:r>
-        <w:t xml:space="preserve">, using GasLib-40’s</w:t>
-      </w:r>
-      <w:r>
-        <w:t xml:space="preserve"> </w:t>
-      </w:r>
-      <w:r>
-        <w:rPr>
-          <w:b/>
-          <w:bCs/>
-        </w:rPr>
-        <w:t xml:space="preserve">native pipe</w:t>
-      </w:r>
-      <w:r>
-        <w:rPr>
-          <w:b/>
-          <w:bCs/>
-        </w:rPr>
-        <w:t xml:space="preserve"> </w:t>
-      </w:r>
-      <w:r>
-        <w:rPr>
-          <w:b/>
-          <w:bCs/>
-        </w:rPr>
-        <w:t xml:space="preserve">lengths and diameters</w:t>
-      </w:r>
-      <w:r>
-        <w:t xml:space="preserve"> </w:t>
-      </w:r>
-      <w:r>
-        <w:t xml:space="preserve">(21.6/7.0/58.2 km; 1000/1000/800 mm). The hydraulic resistances and</w:t>
-      </w:r>
-      <w:r>
-        <w:t xml:space="preserve"> </w:t>
-      </w:r>
-      <w:r>
-        <w:t xml:space="preserve">line-pack capacitances are computed from this geometry (K ∝ L/D⁵, β ∝ L·D²) and preserve its</w:t>
-      </w:r>
-      <w:r>
-        <w:t xml:space="preserve"> </w:t>
-      </w:r>
-      <w:r>
-        <w:t xml:space="preserve">relative ordering; we affinely map them into the env’s numerically-stable band (the raw 25× K</w:t>
-      </w:r>
-      <w:r>
-        <w:t xml:space="preserve"> </w:t>
-      </w:r>
-      <w:r>
-        <w:t xml:space="preserve">spread and a tiny mid-chain capacitance make the simplified explicit-Euler line-pack model stiff).</w:t>
-      </w:r>
-      <w:r>
-        <w:t xml:space="preserve"> </w:t>
-      </w:r>
-      <w:r>
-        <w:t xml:space="preserve">Two honesty notes: this buys</w:t>
-      </w:r>
-      <w:r>
-        <w:t xml:space="preserve"> </w:t>
-      </w:r>
-      <w:r>
-        <w:rPr>
-          <w:i/>
-          <w:iCs/>
-        </w:rPr>
-        <w:t xml:space="preserve">real topology + real pipe geometry</w:t>
-      </w:r>
-      <w:r>
-        <w:t xml:space="preserve">, not fully real data — the</w:t>
-      </w:r>
-      <w:r>
-        <w:t xml:space="preserve"> </w:t>
-      </w:r>
-      <w:r>
-        <w:t xml:space="preserve">geometry needed recalibration for stability, and the TOU electricity price stays synthetic because</w:t>
-      </w:r>
-      <w:r>
-        <w:t xml:space="preserve"> </w:t>
-      </w:r>
-      <w:r>
-        <w:t xml:space="preserve">GasLib is a gas-only library with no electricity dimension.</w:t>
-      </w:r>
-    </w:p>
-    <w:p>
-      <w:pPr>
-        <w:pStyle w:val="BodyText"/>
-      </w:pPr>
-      <w:r>
-        <w:rPr>
-          <w:i/>
-          <w:iCs/>
-        </w:rPr>
-        <w:t xml:space="preserve">Table 3. GasLib-40-derived network (3 real demand nodes), 150k steps, 3 seeds, 6 perturbed scenarios.</w:t>
-      </w:r>
-    </w:p>
-    <w:tbl>
-      <w:tblPr>
-        <w:tblStyle w:val="Table"/>
-        <w:tblW w:type="pct" w:w="5000"/>
-        <w:tblLayout w:type="fixed"/>
-        <w:tblLook w:firstRow="1" w:lastRow="0" w:firstColumn="0" w:lastColumn="0" w:noHBand="0" w:noVBand="0" w:val="0020"/>
-      </w:tblPr>
-      <w:tblGrid>
-        <w:gridCol w:w="1131"/>
-        <w:gridCol w:w="1131"/>
-        <w:gridCol w:w="1131"/>
-        <w:gridCol w:w="1131"/>
-        <w:gridCol w:w="1131"/>
-        <w:gridCol w:w="1131"/>
-        <w:gridCol w:w="1131"/>
-      </w:tblGrid>
-      <w:tr>
-        <w:trPr>
-          <w:tblHeader w:val="on"/>
-        </w:trPr>
-        <w:tc>
-          <w:tcPr/>
-          <w:p>
-            <w:pPr>
-              <w:pStyle w:val="Compact"/>
-            </w:pPr>
-            <w:r>
-              <w:t xml:space="preserve">Method</w:t>
-            </w:r>
-          </w:p>
-        </w:tc>
-        <w:tc>
-          <w:tcPr/>
-          <w:p>
-            <w:pPr>
-              <w:pStyle w:val="Compact"/>
-            </w:pPr>
-            <w:r>
-              <w:t xml:space="preserve">Nom cost</w:t>
-            </w:r>
-          </w:p>
-        </w:tc>
-        <w:tc>
-          <w:tcPr/>
-          <w:p>
-            <w:pPr>
-              <w:pStyle w:val="Compact"/>
-            </w:pPr>
-            <w:r>
-              <w:t xml:space="preserve">Viol-h</w:t>
-            </w:r>
-          </w:p>
-        </w:tc>
-        <w:tc>
-          <w:tcPr/>
-          <w:p>
-            <w:pPr>
-              <w:pStyle w:val="Compact"/>
-            </w:pPr>
-            <w:r>
-              <w:t xml:space="preserve">Term-gap</w:t>
-            </w:r>
-          </w:p>
-        </w:tc>
-        <w:tc>
-          <w:tcPr/>
-          <w:p>
-            <w:pPr>
-              <w:pStyle w:val="Compact"/>
-            </w:pPr>
-            <w:r>
-              <w:t xml:space="preserve">Robust cost</w:t>
-            </w:r>
-          </w:p>
-        </w:tc>
-        <w:tc>
-          <w:tcPr/>
-          <w:p>
-            <w:pPr>
-              <w:pStyle w:val="Compact"/>
-            </w:pPr>
-            <w:r>
-              <w:t xml:space="preserve">Robust viol</w:t>
-            </w:r>
-          </w:p>
-        </w:tc>
-        <w:tc>
-          <w:tcPr/>
-          <w:p>
-            <w:pPr>
-              <w:pStyle w:val="Compact"/>
-            </w:pPr>
-            <w:r>
-              <w:t xml:space="preserve">Latency</w:t>
-            </w:r>
-          </w:p>
-        </w:tc>
-      </w:tr>
-      <w:tr>
-        <w:tc>
-          <w:tcPr/>
-          <w:p>
-            <w:pPr>
-              <w:pStyle w:val="Compact"/>
-            </w:pPr>
-            <w:r>
-              <w:t xml:space="preserve">GA (continuous)</w:t>
-            </w:r>
-          </w:p>
-        </w:tc>
-        <w:tc>
-          <w:tcPr/>
-          <w:p>
-            <w:pPr>
-              <w:pStyle w:val="Compact"/>
-            </w:pPr>
-            <w:r>
-              <w:rPr>
-                <w:b/>
-                <w:bCs/>
-              </w:rPr>
-              <w:t xml:space="preserve">5.57 ± 0.4</w:t>
-            </w:r>
-          </w:p>
-        </w:tc>
-        <w:tc>
-          <w:tcPr/>
-          <w:p>
-            <w:pPr>
-              <w:pStyle w:val="Compact"/>
-            </w:pPr>
-            <w:r>
-              <w:t xml:space="preserve">0.0</w:t>
-            </w:r>
-          </w:p>
-        </w:tc>
-        <w:tc>
-          <w:tcPr/>
-          <w:p>
-            <w:pPr>
-              <w:pStyle w:val="Compact"/>
-            </w:pPr>
-            <w:r>
-              <w:rPr>
-                <w:b/>
-                <w:bCs/>
-              </w:rPr>
-              <w:t xml:space="preserve">5</w:t>
-            </w:r>
-          </w:p>
-        </w:tc>
-        <w:tc>
-          <w:tcPr/>
-          <w:p>
-            <w:pPr>
-              <w:pStyle w:val="Compact"/>
-            </w:pPr>
-            <w:r>
-              <w:t xml:space="preserve">6.76 ± 1.1</w:t>
-            </w:r>
-          </w:p>
-        </w:tc>
-        <w:tc>
-          <w:tcPr/>
-          <w:p>
-            <w:pPr>
-              <w:pStyle w:val="Compact"/>
-            </w:pPr>
-            <w:r>
-              <w:t xml:space="preserve">0.0</w:t>
-            </w:r>
-          </w:p>
-        </w:tc>
-        <w:tc>
-          <w:tcPr/>
-          <w:p>
-            <w:pPr>
-              <w:pStyle w:val="Compact"/>
-            </w:pPr>
-            <w:r>
-              <w:t xml:space="preserve">11.9 s</w:t>
-            </w:r>
-          </w:p>
-        </w:tc>
-      </w:tr>
-      <w:tr>
-        <w:tc>
-          <w:tcPr/>
-          <w:p>
-            <w:pPr>
-              <w:pStyle w:val="Compact"/>
-            </w:pPr>
-            <w:r>
-              <w:rPr>
-                <w:b/>
-                <w:bCs/>
-              </w:rPr>
-              <w:t xml:space="preserve">Distilled-MPC</w:t>
-            </w:r>
-          </w:p>
-        </w:tc>
-        <w:tc>
-          <w:tcPr/>
-          <w:p>
-            <w:pPr>
-              <w:pStyle w:val="Compact"/>
-            </w:pPr>
-            <w:r>
-              <w:rPr>
-                <w:b/>
-                <w:bCs/>
-              </w:rPr>
-              <w:t xml:space="preserve">5.26 ± 0.6</w:t>
-            </w:r>
-          </w:p>
-        </w:tc>
-        <w:tc>
-          <w:tcPr/>
-          <w:p>
-            <w:pPr>
-              <w:pStyle w:val="Compact"/>
-            </w:pPr>
-            <w:r>
-              <w:rPr>
-                <w:b/>
-                <w:bCs/>
-              </w:rPr>
-              <w:t xml:space="preserve">0.0</w:t>
-            </w:r>
-          </w:p>
-        </w:tc>
-        <w:tc>
-          <w:tcPr/>
-          <w:p>
-            <w:pPr>
-              <w:pStyle w:val="Compact"/>
-            </w:pPr>
-            <w:r>
-              <w:t xml:space="preserve">111</w:t>
-            </w:r>
-          </w:p>
-        </w:tc>
-        <w:tc>
-          <w:tcPr/>
-          <w:p>
-            <w:pPr>
-              <w:pStyle w:val="Compact"/>
-            </w:pPr>
-            <w:r>
-              <w:t xml:space="preserve">6.53 ± 1.2</w:t>
-            </w:r>
-          </w:p>
-        </w:tc>
-        <w:tc>
-          <w:tcPr/>
-          <w:p>
-            <w:pPr>
-              <w:pStyle w:val="Compact"/>
-            </w:pPr>
-            <w:r>
-              <w:t xml:space="preserve">0.1</w:t>
-            </w:r>
-          </w:p>
-        </w:tc>
-        <w:tc>
-          <w:tcPr/>
-          <w:p>
-            <w:pPr>
-              <w:pStyle w:val="Compact"/>
-            </w:pPr>
-            <w:r>
-              <w:rPr>
-                <w:b/>
-                <w:bCs/>
-              </w:rPr>
-              <w:t xml:space="preserve">2.8 ms</w:t>
-            </w:r>
-          </w:p>
-        </w:tc>
-      </w:tr>
-      <w:tr>
-        <w:tc>
-          <w:tcPr/>
-          <w:p>
-            <w:pPr>
-              <w:pStyle w:val="Compact"/>
-            </w:pPr>
-            <w:r>
-              <w:t xml:space="preserve">DP-oracle</w:t>
-            </w:r>
-          </w:p>
-        </w:tc>
-        <w:tc>
-          <w:tcPr/>
-          <w:p>
-            <w:pPr>
-              <w:pStyle w:val="Compact"/>
-            </w:pPr>
-            <w:r>
-              <w:t xml:space="preserve">6.70</w:t>
-            </w:r>
-          </w:p>
-        </w:tc>
-        <w:tc>
-          <w:tcPr/>
-          <w:p>
-            <w:pPr>
-              <w:pStyle w:val="Compact"/>
-            </w:pPr>
-            <w:r>
-              <w:t xml:space="preserve">0.0</w:t>
-            </w:r>
-          </w:p>
-        </w:tc>
-        <w:tc>
-          <w:tcPr/>
-          <w:p>
-            <w:pPr>
-              <w:pStyle w:val="Compact"/>
-            </w:pPr>
-            <w:r>
-              <w:t xml:space="preserve">141</w:t>
-            </w:r>
-          </w:p>
-        </w:tc>
-        <w:tc>
-          <w:tcPr/>
-          <w:p>
-            <w:pPr>
-              <w:pStyle w:val="Compact"/>
-            </w:pPr>
-            <w:r>
-              <w:t xml:space="preserve">6.64 ± 0.8</w:t>
-            </w:r>
-          </w:p>
-        </w:tc>
-        <w:tc>
-          <w:tcPr/>
-          <w:p>
-            <w:pPr>
-              <w:pStyle w:val="Compact"/>
-            </w:pPr>
-            <w:r>
-              <w:t xml:space="preserve">0.0</w:t>
-            </w:r>
-          </w:p>
-        </w:tc>
-        <w:tc>
-          <w:tcPr/>
-          <w:p>
-            <w:pPr>
-              <w:pStyle w:val="Compact"/>
-            </w:pPr>
-            <w:r>
-              <w:t xml:space="preserve">6.3 s</w:t>
-            </w:r>
-          </w:p>
-        </w:tc>
-      </w:tr>
-      <w:tr>
-        <w:tc>
-          <w:tcPr/>
-          <w:p>
-            <w:pPr>
-              <w:pStyle w:val="Compact"/>
-            </w:pPr>
-            <w:r>
-              <w:t xml:space="preserve">MPC</w:t>
-            </w:r>
-          </w:p>
-        </w:tc>
-        <w:tc>
-          <w:tcPr/>
-          <w:p>
-            <w:pPr>
-              <w:pStyle w:val="Compact"/>
-            </w:pPr>
-            <w:r>
-              <w:t xml:space="preserve">6.70</w:t>
-            </w:r>
-          </w:p>
-        </w:tc>
-        <w:tc>
-          <w:tcPr/>
-          <w:p>
-            <w:pPr>
-              <w:pStyle w:val="Compact"/>
-            </w:pPr>
-            <w:r>
-              <w:t xml:space="preserve">0.0</w:t>
-            </w:r>
-          </w:p>
-        </w:tc>
-        <w:tc>
-          <w:tcPr/>
-          <w:p>
-            <w:pPr>
-              <w:pStyle w:val="Compact"/>
-            </w:pPr>
-            <w:r>
-              <w:t xml:space="preserve">141</w:t>
-            </w:r>
-          </w:p>
-        </w:tc>
-        <w:tc>
-          <w:tcPr/>
-          <w:p>
-            <w:pPr>
-              <w:pStyle w:val="Compact"/>
-            </w:pPr>
-            <w:r>
-              <w:t xml:space="preserve">6.91 ± 0.8</w:t>
-            </w:r>
-          </w:p>
-        </w:tc>
-        <w:tc>
-          <w:tcPr/>
-          <w:p>
-            <w:pPr>
-              <w:pStyle w:val="Compact"/>
-            </w:pPr>
-            <w:r>
-              <w:t xml:space="preserve">0.0</w:t>
-            </w:r>
-          </w:p>
-        </w:tc>
-        <w:tc>
-          <w:tcPr/>
-          <w:p>
-            <w:pPr>
-              <w:pStyle w:val="Compact"/>
-            </w:pPr>
-            <w:r>
-              <w:t xml:space="preserve">6.7 s</w:t>
-            </w:r>
-          </w:p>
-        </w:tc>
-      </w:tr>
-      <w:tr>
-        <w:tc>
-          <w:tcPr/>
-          <w:p>
-            <w:pPr>
-              <w:pStyle w:val="Compact"/>
-            </w:pPr>
-            <w:r>
-              <w:t xml:space="preserve">PPO</w:t>
-            </w:r>
-          </w:p>
-        </w:tc>
-        <w:tc>
-          <w:tcPr/>
-          <w:p>
-            <w:pPr>
-              <w:pStyle w:val="Compact"/>
-            </w:pPr>
-            <w:r>
-              <w:t xml:space="preserve">13.16 ± 1.6</w:t>
-            </w:r>
-          </w:p>
-        </w:tc>
-        <w:tc>
-          <w:tcPr/>
-          <w:p>
-            <w:pPr>
-              <w:pStyle w:val="Compact"/>
-            </w:pPr>
-            <w:r>
-              <w:t xml:space="preserve">0.0</w:t>
-            </w:r>
-          </w:p>
-        </w:tc>
-        <w:tc>
-          <w:tcPr/>
-          <w:p>
-            <w:pPr>
-              <w:pStyle w:val="Compact"/>
-            </w:pPr>
-            <w:r>
-              <w:t xml:space="preserve">602</w:t>
-            </w:r>
-          </w:p>
-        </w:tc>
-        <w:tc>
-          <w:tcPr/>
-          <w:p>
-            <w:pPr>
-              <w:pStyle w:val="Compact"/>
-            </w:pPr>
-            <w:r>
-              <w:t xml:space="preserve">12.91 ± 2.8</w:t>
-            </w:r>
-          </w:p>
-        </w:tc>
-        <w:tc>
-          <w:tcPr/>
-          <w:p>
-            <w:pPr>
-              <w:pStyle w:val="Compact"/>
-            </w:pPr>
-            <w:r>
-              <w:t xml:space="preserve">0.1</w:t>
-            </w:r>
-          </w:p>
-        </w:tc>
-        <w:tc>
-          <w:tcPr/>
-          <w:p>
-            <w:pPr>
-              <w:pStyle w:val="Compact"/>
-            </w:pPr>
-            <w:r>
-              <w:t xml:space="preserve">3.6 ms</w:t>
-            </w:r>
-          </w:p>
-        </w:tc>
-      </w:tr>
-      <w:tr>
-        <w:tc>
-          <w:tcPr/>
-          <w:p>
-            <w:pPr>
-              <w:pStyle w:val="Compact"/>
-            </w:pPr>
-            <w:r>
-              <w:t xml:space="preserve">SAC</w:t>
-            </w:r>
-          </w:p>
-        </w:tc>
-        <w:tc>
-          <w:tcPr/>
-          <w:p>
-            <w:pPr>
-              <w:pStyle w:val="Compact"/>
-            </w:pPr>
-            <w:r>
-              <w:t xml:space="preserve">16.07 ± 3.4</w:t>
-            </w:r>
-          </w:p>
-        </w:tc>
-        <w:tc>
-          <w:tcPr/>
-          <w:p>
-            <w:pPr>
-              <w:pStyle w:val="Compact"/>
-            </w:pPr>
-            <w:r>
-              <w:t xml:space="preserve">0.0</w:t>
-            </w:r>
-          </w:p>
-        </w:tc>
-        <w:tc>
-          <w:tcPr/>
-          <w:p>
-            <w:pPr>
-              <w:pStyle w:val="Compact"/>
-            </w:pPr>
-            <w:r>
-              <w:t xml:space="preserve">300</w:t>
-            </w:r>
-          </w:p>
-        </w:tc>
-        <w:tc>
-          <w:tcPr/>
-          <w:p>
-            <w:pPr>
-              <w:pStyle w:val="Compact"/>
-            </w:pPr>
-            <w:r>
-              <w:t xml:space="preserve">14.21 ± 3.5</w:t>
-            </w:r>
-          </w:p>
-        </w:tc>
-        <w:tc>
-          <w:tcPr/>
-          <w:p>
-            <w:pPr>
-              <w:pStyle w:val="Compact"/>
-            </w:pPr>
-            <w:r>
-              <w:t xml:space="preserve">0.0</w:t>
-            </w:r>
-          </w:p>
-        </w:tc>
-        <w:tc>
-          <w:tcPr/>
-          <w:p>
-            <w:pPr>
-              <w:pStyle w:val="Compact"/>
-            </w:pPr>
-            <w:r>
-              <w:t xml:space="preserve">4.9 ms</w:t>
-            </w:r>
-          </w:p>
-        </w:tc>
-      </w:tr>
-      <w:tr>
-        <w:tc>
-          <w:tcPr/>
-          <w:p>
-            <w:pPr>
-              <w:pStyle w:val="Compact"/>
-            </w:pPr>
-            <w:r>
-              <w:t xml:space="preserve">Constrained-SAC</w:t>
-            </w:r>
-          </w:p>
-        </w:tc>
-        <w:tc>
-          <w:tcPr/>
-          <w:p>
-            <w:pPr>
-              <w:pStyle w:val="Compact"/>
-            </w:pPr>
-            <w:r>
-              <w:t xml:space="preserve">17.08 ± 1.5</w:t>
-            </w:r>
-          </w:p>
-        </w:tc>
-        <w:tc>
-          <w:tcPr/>
-          <w:p>
-            <w:pPr>
-              <w:pStyle w:val="Compact"/>
-            </w:pPr>
-            <w:r>
-              <w:t xml:space="preserve">0.0</w:t>
-            </w:r>
-          </w:p>
-        </w:tc>
-        <w:tc>
-          <w:tcPr/>
-          <w:p>
-            <w:pPr>
-              <w:pStyle w:val="Compact"/>
-            </w:pPr>
-            <w:r>
-              <w:t xml:space="preserve">66</w:t>
-            </w:r>
-          </w:p>
-        </w:tc>
-        <w:tc>
-          <w:tcPr/>
-          <w:p>
-            <w:pPr>
-              <w:pStyle w:val="Compact"/>
-            </w:pPr>
-            <w:r>
-              <w:t xml:space="preserve">17.43 ± 1.6</w:t>
-            </w:r>
-          </w:p>
-        </w:tc>
-        <w:tc>
-          <w:tcPr/>
-          <w:p>
-            <w:pPr>
-              <w:pStyle w:val="Compact"/>
-            </w:pPr>
-            <w:r>
-              <w:t xml:space="preserve">0.0</w:t>
-            </w:r>
-          </w:p>
-        </w:tc>
-        <w:tc>
-          <w:tcPr/>
-          <w:p>
-            <w:pPr>
-              <w:pStyle w:val="Compact"/>
-            </w:pPr>
-            <w:r>
-              <w:t xml:space="preserve">4.7 ms</w:t>
-            </w:r>
-          </w:p>
-        </w:tc>
-      </w:tr>
-      <w:tr>
-        <w:tc>
-          <w:tcPr/>
-          <w:p>
-            <w:pPr>
-              <w:pStyle w:val="Compact"/>
-            </w:pPr>
-            <w:r>
-              <w:t xml:space="preserve">TD3</w:t>
-            </w:r>
-          </w:p>
-        </w:tc>
-        <w:tc>
-          <w:tcPr/>
-          <w:p>
-            <w:pPr>
-              <w:pStyle w:val="Compact"/>
-            </w:pPr>
-            <w:r>
-              <w:t xml:space="preserve">22.58 ± 8.7</w:t>
-            </w:r>
-          </w:p>
-        </w:tc>
-        <w:tc>
-          <w:tcPr/>
-          <w:p>
-            <w:pPr>
-              <w:pStyle w:val="Compact"/>
-            </w:pPr>
-            <w:r>
-              <w:t xml:space="preserve">0.3</w:t>
-            </w:r>
-          </w:p>
-        </w:tc>
-        <w:tc>
-          <w:tcPr/>
-          <w:p>
-            <w:pPr>
-              <w:pStyle w:val="Compact"/>
-            </w:pPr>
-            <w:r>
-              <w:t xml:space="preserve">1123</w:t>
-            </w:r>
-          </w:p>
-        </w:tc>
-        <w:tc>
-          <w:tcPr/>
-          <w:p>
-            <w:pPr>
-              <w:pStyle w:val="Compact"/>
-            </w:pPr>
-            <w:r>
-              <w:t xml:space="preserve">20.07 ± 7.5</w:t>
-            </w:r>
-          </w:p>
-        </w:tc>
-        <w:tc>
-          <w:tcPr/>
-          <w:p>
-            <w:pPr>
-              <w:pStyle w:val="Compact"/>
-            </w:pPr>
-            <w:r>
-              <w:t xml:space="preserve">0.4</w:t>
-            </w:r>
-          </w:p>
-        </w:tc>
-        <w:tc>
-          <w:tcPr/>
-          <w:p>
-            <w:pPr>
-              <w:pStyle w:val="Compact"/>
-            </w:pPr>
-            <w:r>
-              <w:t xml:space="preserve">4.4 ms</w:t>
-            </w:r>
-          </w:p>
-        </w:tc>
-      </w:tr>
-      <w:tr>
-        <w:tc>
-          <w:tcPr/>
-          <w:p>
-            <w:pPr>
-              <w:pStyle w:val="Compact"/>
-            </w:pPr>
-            <w:r>
-              <w:t xml:space="preserve">Rule-based</w:t>
-            </w:r>
-          </w:p>
-        </w:tc>
-        <w:tc>
-          <w:tcPr/>
-          <w:p>
-            <w:pPr>
-              <w:pStyle w:val="Compact"/>
-            </w:pPr>
-            <w:r>
-              <w:t xml:space="preserve">31.74</w:t>
-            </w:r>
-          </w:p>
-        </w:tc>
-        <w:tc>
-          <w:tcPr/>
-          <w:p>
-            <w:pPr>
-              <w:pStyle w:val="Compact"/>
-            </w:pPr>
-            <w:r>
-              <w:t xml:space="preserve">13.0</w:t>
-            </w:r>
-          </w:p>
-        </w:tc>
-        <w:tc>
-          <w:tcPr/>
-          <w:p>
-            <w:pPr>
-              <w:pStyle w:val="Compact"/>
-            </w:pPr>
-            <w:r>
-              <w:t xml:space="preserve">7388</w:t>
-            </w:r>
-          </w:p>
-        </w:tc>
-        <w:tc>
-          <w:tcPr/>
-          <w:p>
-            <w:pPr>
-              <w:pStyle w:val="Compact"/>
-            </w:pPr>
-            <w:r>
-              <w:t xml:space="preserve">32.15 ± 0.5</w:t>
-            </w:r>
-          </w:p>
-        </w:tc>
-        <w:tc>
-          <w:tcPr/>
-          <w:p>
-            <w:pPr>
-              <w:pStyle w:val="Compact"/>
-            </w:pPr>
-            <w:r>
-              <w:t xml:space="preserve">12.7</w:t>
-            </w:r>
-          </w:p>
-        </w:tc>
-        <w:tc>
-          <w:tcPr/>
-          <w:p>
-            <w:pPr>
-              <w:pStyle w:val="Compact"/>
-            </w:pPr>
-            <w:r>
-              <w:t xml:space="preserve">2.3 ms</w:t>
-            </w:r>
-          </w:p>
-        </w:tc>
-      </w:tr>
-    </w:tbl>
-    <w:p>
-      <w:pPr>
-        <w:pStyle w:val="BodyText"/>
-      </w:pPr>
-      <w:r>
-        <w:rPr>
-          <w:b/>
-          <w:bCs/>
-        </w:rPr>
-        <w:t xml:space="preserve">Reading the GasLib-40 results — the cleanest case for the method.</w:t>
-      </w:r>
-      <w:r>
-        <w:t xml:space="preserve"> </w:t>
-      </w:r>
-      <w:r>
-        <w:t xml:space="preserve">-</w:t>
-      </w:r>
-      <w:r>
-        <w:t xml:space="preserve"> </w:t>
-      </w:r>
-      <w:r>
-        <w:rPr>
-          <w:b/>
-          <w:bCs/>
-        </w:rPr>
-        <w:t xml:space="preserve">Distillation is the standout:</w:t>
-      </w:r>
-      <w:r>
-        <w:t xml:space="preserve"> </w:t>
-      </w:r>
-      <w:r>
-        <w:t xml:space="preserve">Distilled-MPC reaches cost</w:t>
-      </w:r>
-      <w:r>
-        <w:t xml:space="preserve"> </w:t>
-      </w:r>
-      <w:r>
-        <w:rPr>
-          <w:b/>
-          <w:bCs/>
-        </w:rPr>
-        <w:t xml:space="preserve">5.26 at zero violations</w:t>
-      </w:r>
-      <w:r>
-        <w:t xml:space="preserve"> </w:t>
-      </w:r>
-      <w:r>
-        <w:t xml:space="preserve">— it</w:t>
-      </w:r>
-      <w:r>
-        <w:t xml:space="preserve"> </w:t>
-      </w:r>
-      <w:r>
-        <w:t xml:space="preserve">matches the continuous GA optimum (5.57),</w:t>
-      </w:r>
-      <w:r>
-        <w:t xml:space="preserve"> </w:t>
-      </w:r>
-      <w:r>
-        <w:rPr>
-          <w:i/>
-          <w:iCs/>
-        </w:rPr>
-        <w:t xml:space="preserve">undercuts</w:t>
-      </w:r>
-      <w:r>
-        <w:t xml:space="preserve"> </w:t>
-      </w:r>
-      <w:r>
-        <w:t xml:space="preserve">the grid-MPC teacher (6.70), nails the</w:t>
-      </w:r>
-      <w:r>
-        <w:t xml:space="preserve"> </w:t>
-      </w:r>
-      <w:r>
-        <w:t xml:space="preserve">terminal target, and runs in</w:t>
-      </w:r>
-      <w:r>
-        <w:t xml:space="preserve"> </w:t>
-      </w:r>
-      <w:r>
-        <w:rPr>
-          <w:b/>
-          <w:bCs/>
-        </w:rPr>
-        <w:t xml:space="preserve">2.8 ms (≈2300× faster than the 6.5 s MPC)</w:t>
-      </w:r>
-      <w:r>
-        <w:t xml:space="preserve">. On a real-geometry</w:t>
-      </w:r>
-      <w:r>
-        <w:t xml:space="preserve"> </w:t>
-      </w:r>
-      <w:r>
-        <w:t xml:space="preserve">network the</w:t>
-      </w:r>
-      <w:r>
-        <w:t xml:space="preserve"> </w:t>
-      </w:r>
-      <w:r>
-        <w:t xml:space="preserve">“distil a model-based controller”</w:t>
-      </w:r>
-      <w:r>
-        <w:t xml:space="preserve"> </w:t>
-      </w:r>
-      <w:r>
-        <w:t xml:space="preserve">recipe gives the best learned controller outright.</w:t>
-      </w:r>
-      <w:r>
-        <w:t xml:space="preserve"> </w:t>
-      </w:r>
-      <w:r>
-        <w:t xml:space="preserve">-</w:t>
-      </w:r>
-      <w:r>
-        <w:t xml:space="preserve"> </w:t>
-      </w:r>
-      <w:r>
-        <w:rPr>
-          <w:b/>
-          <w:bCs/>
-        </w:rPr>
-        <w:t xml:space="preserve">DP/MPC are clean here.</w:t>
-      </w:r>
-      <w:r>
-        <w:t xml:space="preserve"> </w:t>
-      </w:r>
-      <w:r>
-        <w:t xml:space="preserve">Unlike the branched benchmark, the chain topology keeps the 3-D grid</w:t>
-      </w:r>
-      <w:r>
-        <w:t xml:space="preserve"> </w:t>
-      </w:r>
-      <w:r>
-        <w:t xml:space="preserve">DP feasible (0 violations), so DP/MPC are valid references on this network.</w:t>
-      </w:r>
-      <w:r>
-        <w:t xml:space="preserve"> </w:t>
-      </w:r>
-      <w:r>
-        <w:t xml:space="preserve">-</w:t>
-      </w:r>
-      <w:r>
-        <w:t xml:space="preserve"> </w:t>
-      </w:r>
-      <w:r>
-        <w:rPr>
-          <w:b/>
-          <w:bCs/>
-        </w:rPr>
-        <w:t xml:space="preserve">Constraint-aware SAC’s reliability advantage reappears:</w:t>
-      </w:r>
-      <w:r>
-        <w:t xml:space="preserve"> </w:t>
-      </w:r>
-      <w:r>
-        <w:t xml:space="preserve">it is feasible with the tightest</w:t>
-      </w:r>
-      <w:r>
-        <w:t xml:space="preserve"> </w:t>
-      </w:r>
-      <w:r>
-        <w:t xml:space="preserve">terminal compliance (gap 66 vs SAC’s 300) and the lowest seed variance (±1.5 vs SAC ±3.4) —</w:t>
-      </w:r>
-      <w:r>
-        <w:t xml:space="preserve"> </w:t>
-      </w:r>
-      <w:r>
-        <w:t xml:space="preserve">the opposite of the branched case, confirming the ranking is network-dependent but that</w:t>
-      </w:r>
-      <w:r>
-        <w:t xml:space="preserve"> </w:t>
-      </w:r>
-      <w:r>
-        <w:t xml:space="preserve">Constrained-SAC is the more reliable from-scratch learner where the dual settings suit the network.</w:t>
-      </w:r>
-      <w:r>
-        <w:t xml:space="preserve"> </w:t>
-      </w:r>
-      <w:r>
-        <w:t xml:space="preserve">-</w:t>
-      </w:r>
-      <w:r>
-        <w:t xml:space="preserve"> </w:t>
-      </w:r>
-      <w:r>
-        <w:rPr>
-          <w:b/>
-          <w:bCs/>
-        </w:rPr>
-        <w:t xml:space="preserve">The core enabler holds a third time:</w:t>
-      </w:r>
-      <w:r>
-        <w:t xml:space="preserve"> </w:t>
-      </w:r>
-      <w:r>
-        <w:t xml:space="preserve">every feasibility-aware DRL agent is feasible (TD3 the</w:t>
-      </w:r>
-      <w:r>
-        <w:t xml:space="preserve"> </w:t>
-      </w:r>
-      <w:r>
-        <w:t xml:space="preserve">only wobble at 0.3), and the from-scratch cost premium (~2.5–3×) is again removed by distillation.</w:t>
-      </w:r>
-    </w:p>
-    <w:p>
-      <w:pPr>
-        <w:pStyle w:val="BodyText"/>
-      </w:pPr>
-      <w:r>
-        <w:t xml:space="preserve">Across all three networks the conclusion is consistent: feasibility transfers, distillation delivers</w:t>
-      </w:r>
-      <w:r>
-        <w:t xml:space="preserve"> </w:t>
-      </w:r>
-      <w:r>
-        <w:t xml:space="preserve">near-optimal feasible control at millisecond latency, and from-scratch RL trails on cost.</w:t>
+        <w:t xml:space="preserve">Figure 8. Branched benchmark — nominal 24-h cost by method (mean ± std). The feasibility-aware DRL agents stay in-band; SAC is cost-competitive with the GA optimum.</w:t>
       </w:r>
     </w:p>
     <w:p>
@@ -12945,18 +11720,18 @@
           <wp:inline>
             <wp:extent cx="5334000" cy="2963333"/>
             <wp:effectExtent b="0" l="0" r="0" t="0"/>
-            <wp:docPr descr="Figure 9. GasLib-40-derived network — nominal cost by method (left) and 24-h dispatch (right)." title="" id="63" name="Picture"/>
+            <wp:docPr descr="Figure 9. Branched benchmark — robustness (cost mean ± std and violation-hours) under perturbed demand/price." title="" id="62" name="Picture"/>
             <a:graphic>
               <a:graphicData uri="http://schemas.openxmlformats.org/drawingml/2006/picture">
                 <pic:pic>
                   <pic:nvPicPr>
-                    <pic:cNvPr descr="../models/exports/paper_gaslib/fig_cost_nominal.png" id="64" name="Picture"/>
+                    <pic:cNvPr descr="../models/exports/paper_branched/fig_robustness.png" id="63" name="Picture"/>
                     <pic:cNvPicPr>
                       <a:picLocks noChangeArrowheads="1" noChangeAspect="1"/>
                     </pic:cNvPicPr>
                   </pic:nvPicPr>
                   <pic:blipFill>
-                    <a:blip r:embed="rId62"/>
+                    <a:blip r:embed="rId61"/>
                     <a:stretch>
                       <a:fillRect/>
                     </a:stretch>
@@ -12988,7 +11763,1551 @@
         <w:pStyle w:val="ImageCaption"/>
       </w:pPr>
       <w:r>
-        <w:t xml:space="preserve">Figure 9. GasLib-40-derived network — nominal cost by method (left) and 24-h dispatch (right).</w:t>
+        <w:t xml:space="preserve">Figure 9. Branched benchmark — robustness (cost mean ± std and violation-hours) under perturbed demand/price.</w:t>
+      </w:r>
+    </w:p>
+    <w:p>
+      <w:pPr>
+        <w:pStyle w:val="BodyText"/>
+      </w:pPr>
+      <w:r>
+        <w:t xml:space="preserve">Net: the methodological contributions — the feasibility-aware action realisation, feasible</w:t>
+      </w:r>
+      <w:r>
+        <w:t xml:space="preserve"> </w:t>
+      </w:r>
+      <w:r>
+        <w:t xml:space="preserve">from-scratch DRL, and MPC distillation — all transfer to the larger, parameter-realistic network;</w:t>
+      </w:r>
+      <w:r>
+        <w:t xml:space="preserve"> </w:t>
+      </w:r>
+      <w:r>
+        <w:t xml:space="preserve">the constraint-aware-SAC ranking and the grid-DP reference are the network-dependent caveats.</w:t>
+      </w:r>
+    </w:p>
+    <w:bookmarkEnd w:id="64"/>
+    <w:bookmarkStart w:id="68" w:name="Xd3ca94ac4eba9be6722f26c7cab872a57fb4a24"/>
+    <w:p>
+      <w:pPr>
+        <w:pStyle w:val="Heading3"/>
+      </w:pPr>
+      <w:r>
+        <w:t xml:space="preserve">6.9 Real-geometry network from GasLib-40 (Table 3)</w:t>
+      </w:r>
+    </w:p>
+    <w:p>
+      <w:pPr>
+        <w:pStyle w:val="FirstParagraph"/>
+      </w:pPr>
+      <w:r>
+        <w:t xml:space="preserve">To move beyond hand-set parameters we extract a sub-network from the</w:t>
+      </w:r>
+      <w:r>
+        <w:t xml:space="preserve"> </w:t>
+      </w:r>
+      <w:r>
+        <w:rPr>
+          <w:b/>
+          <w:bCs/>
+        </w:rPr>
+        <w:t xml:space="preserve">real GasLib-40 instance</w:t>
+      </w:r>
+      <w:r>
+        <w:t xml:space="preserve"> </w:t>
+      </w:r>
+      <w:r>
+        <w:t xml:space="preserve">(a model of the German low-calorific transmission grid): the line from the compressor-station node</w:t>
+      </w:r>
+      <w:r>
+        <w:t xml:space="preserve"> </w:t>
+      </w:r>
+      <w:r>
+        <w:rPr>
+          <w:rStyle w:val="VerbatimChar"/>
+        </w:rPr>
+        <w:t xml:space="preserve">innode_6</w:t>
+      </w:r>
+      <w:r>
+        <w:t xml:space="preserve"> </w:t>
+      </w:r>
+      <w:r>
+        <w:t xml:space="preserve">through the demand chain</w:t>
+      </w:r>
+      <w:r>
+        <w:t xml:space="preserve"> </w:t>
+      </w:r>
+      <w:r>
+        <w:rPr>
+          <w:rStyle w:val="VerbatimChar"/>
+        </w:rPr>
+        <w:t xml:space="preserve">sink_13 → sink_14 → sink_10</w:t>
+      </w:r>
+      <w:r>
+        <w:t xml:space="preserve">, using GasLib-40’s</w:t>
+      </w:r>
+      <w:r>
+        <w:t xml:space="preserve"> </w:t>
+      </w:r>
+      <w:r>
+        <w:rPr>
+          <w:b/>
+          <w:bCs/>
+        </w:rPr>
+        <w:t xml:space="preserve">native pipe</w:t>
+      </w:r>
+      <w:r>
+        <w:rPr>
+          <w:b/>
+          <w:bCs/>
+        </w:rPr>
+        <w:t xml:space="preserve"> </w:t>
+      </w:r>
+      <w:r>
+        <w:rPr>
+          <w:b/>
+          <w:bCs/>
+        </w:rPr>
+        <w:t xml:space="preserve">lengths and diameters</w:t>
+      </w:r>
+      <w:r>
+        <w:t xml:space="preserve"> </w:t>
+      </w:r>
+      <w:r>
+        <w:t xml:space="preserve">(21.6/7.0/58.2 km; 1000/1000/800 mm). The hydraulic resistances and</w:t>
+      </w:r>
+      <w:r>
+        <w:t xml:space="preserve"> </w:t>
+      </w:r>
+      <w:r>
+        <w:t xml:space="preserve">line-pack capacitances are computed from this geometry (K ∝ L/D⁵, β ∝ L·D²) and preserve its</w:t>
+      </w:r>
+      <w:r>
+        <w:t xml:space="preserve"> </w:t>
+      </w:r>
+      <w:r>
+        <w:t xml:space="preserve">relative ordering; we affinely map them into the env’s numerically-stable band (the raw 25× K</w:t>
+      </w:r>
+      <w:r>
+        <w:t xml:space="preserve"> </w:t>
+      </w:r>
+      <w:r>
+        <w:t xml:space="preserve">spread and a tiny mid-chain capacitance make the simplified explicit-Euler line-pack model stiff).</w:t>
+      </w:r>
+      <w:r>
+        <w:t xml:space="preserve"> </w:t>
+      </w:r>
+      <w:r>
+        <w:t xml:space="preserve">Two honesty notes: this buys</w:t>
+      </w:r>
+      <w:r>
+        <w:t xml:space="preserve"> </w:t>
+      </w:r>
+      <w:r>
+        <w:rPr>
+          <w:i/>
+          <w:iCs/>
+        </w:rPr>
+        <w:t xml:space="preserve">real topology + real pipe geometry</w:t>
+      </w:r>
+      <w:r>
+        <w:t xml:space="preserve">, not fully real data — the</w:t>
+      </w:r>
+      <w:r>
+        <w:t xml:space="preserve"> </w:t>
+      </w:r>
+      <w:r>
+        <w:t xml:space="preserve">geometry needed recalibration for stability, and the TOU electricity price stays synthetic because</w:t>
+      </w:r>
+      <w:r>
+        <w:t xml:space="preserve"> </w:t>
+      </w:r>
+      <w:r>
+        <w:t xml:space="preserve">GasLib is a gas-only library with no electricity dimension.</w:t>
+      </w:r>
+    </w:p>
+    <w:p>
+      <w:pPr>
+        <w:pStyle w:val="BodyText"/>
+      </w:pPr>
+      <w:r>
+        <w:rPr>
+          <w:i/>
+          <w:iCs/>
+        </w:rPr>
+        <w:t xml:space="preserve">Table 3. GasLib-40-derived network (3 real demand nodes), 150k steps, 3 seeds, 6 perturbed scenarios.</w:t>
+      </w:r>
+    </w:p>
+    <w:tbl>
+      <w:tblPr>
+        <w:tblStyle w:val="Table"/>
+        <w:tblW w:type="pct" w:w="5000"/>
+        <w:tblLayout w:type="fixed"/>
+        <w:tblLook w:firstRow="1" w:lastRow="0" w:firstColumn="0" w:lastColumn="0" w:noHBand="0" w:noVBand="0" w:val="0020"/>
+      </w:tblPr>
+      <w:tblGrid>
+        <w:gridCol w:w="1131"/>
+        <w:gridCol w:w="1131"/>
+        <w:gridCol w:w="1131"/>
+        <w:gridCol w:w="1131"/>
+        <w:gridCol w:w="1131"/>
+        <w:gridCol w:w="1131"/>
+        <w:gridCol w:w="1131"/>
+      </w:tblGrid>
+      <w:tr>
+        <w:trPr>
+          <w:tblHeader w:val="on"/>
+        </w:trPr>
+        <w:tc>
+          <w:tcPr/>
+          <w:p>
+            <w:pPr>
+              <w:pStyle w:val="Compact"/>
+            </w:pPr>
+            <w:r>
+              <w:t xml:space="preserve">Method</w:t>
+            </w:r>
+          </w:p>
+        </w:tc>
+        <w:tc>
+          <w:tcPr/>
+          <w:p>
+            <w:pPr>
+              <w:pStyle w:val="Compact"/>
+            </w:pPr>
+            <w:r>
+              <w:t xml:space="preserve">Nom cost</w:t>
+            </w:r>
+          </w:p>
+        </w:tc>
+        <w:tc>
+          <w:tcPr/>
+          <w:p>
+            <w:pPr>
+              <w:pStyle w:val="Compact"/>
+            </w:pPr>
+            <w:r>
+              <w:t xml:space="preserve">Viol-h</w:t>
+            </w:r>
+          </w:p>
+        </w:tc>
+        <w:tc>
+          <w:tcPr/>
+          <w:p>
+            <w:pPr>
+              <w:pStyle w:val="Compact"/>
+            </w:pPr>
+            <w:r>
+              <w:t xml:space="preserve">Term-gap</w:t>
+            </w:r>
+          </w:p>
+        </w:tc>
+        <w:tc>
+          <w:tcPr/>
+          <w:p>
+            <w:pPr>
+              <w:pStyle w:val="Compact"/>
+            </w:pPr>
+            <w:r>
+              <w:t xml:space="preserve">Robust cost</w:t>
+            </w:r>
+          </w:p>
+        </w:tc>
+        <w:tc>
+          <w:tcPr/>
+          <w:p>
+            <w:pPr>
+              <w:pStyle w:val="Compact"/>
+            </w:pPr>
+            <w:r>
+              <w:t xml:space="preserve">Robust viol</w:t>
+            </w:r>
+          </w:p>
+        </w:tc>
+        <w:tc>
+          <w:tcPr/>
+          <w:p>
+            <w:pPr>
+              <w:pStyle w:val="Compact"/>
+            </w:pPr>
+            <w:r>
+              <w:t xml:space="preserve">Latency</w:t>
+            </w:r>
+          </w:p>
+        </w:tc>
+      </w:tr>
+      <w:tr>
+        <w:tc>
+          <w:tcPr/>
+          <w:p>
+            <w:pPr>
+              <w:pStyle w:val="Compact"/>
+            </w:pPr>
+            <w:r>
+              <w:t xml:space="preserve">GA (continuous)</w:t>
+            </w:r>
+          </w:p>
+        </w:tc>
+        <w:tc>
+          <w:tcPr/>
+          <w:p>
+            <w:pPr>
+              <w:pStyle w:val="Compact"/>
+            </w:pPr>
+            <w:r>
+              <w:rPr>
+                <w:b/>
+                <w:bCs/>
+              </w:rPr>
+              <w:t xml:space="preserve">5.57 ± 0.4</w:t>
+            </w:r>
+          </w:p>
+        </w:tc>
+        <w:tc>
+          <w:tcPr/>
+          <w:p>
+            <w:pPr>
+              <w:pStyle w:val="Compact"/>
+            </w:pPr>
+            <w:r>
+              <w:t xml:space="preserve">0.0</w:t>
+            </w:r>
+          </w:p>
+        </w:tc>
+        <w:tc>
+          <w:tcPr/>
+          <w:p>
+            <w:pPr>
+              <w:pStyle w:val="Compact"/>
+            </w:pPr>
+            <w:r>
+              <w:rPr>
+                <w:b/>
+                <w:bCs/>
+              </w:rPr>
+              <w:t xml:space="preserve">5</w:t>
+            </w:r>
+          </w:p>
+        </w:tc>
+        <w:tc>
+          <w:tcPr/>
+          <w:p>
+            <w:pPr>
+              <w:pStyle w:val="Compact"/>
+            </w:pPr>
+            <w:r>
+              <w:t xml:space="preserve">6.76 ± 1.1</w:t>
+            </w:r>
+          </w:p>
+        </w:tc>
+        <w:tc>
+          <w:tcPr/>
+          <w:p>
+            <w:pPr>
+              <w:pStyle w:val="Compact"/>
+            </w:pPr>
+            <w:r>
+              <w:t xml:space="preserve">0.0</w:t>
+            </w:r>
+          </w:p>
+        </w:tc>
+        <w:tc>
+          <w:tcPr/>
+          <w:p>
+            <w:pPr>
+              <w:pStyle w:val="Compact"/>
+            </w:pPr>
+            <w:r>
+              <w:t xml:space="preserve">11.9 s</w:t>
+            </w:r>
+          </w:p>
+        </w:tc>
+      </w:tr>
+      <w:tr>
+        <w:tc>
+          <w:tcPr/>
+          <w:p>
+            <w:pPr>
+              <w:pStyle w:val="Compact"/>
+            </w:pPr>
+            <w:r>
+              <w:rPr>
+                <w:b/>
+                <w:bCs/>
+              </w:rPr>
+              <w:t xml:space="preserve">Distilled-MPC</w:t>
+            </w:r>
+          </w:p>
+        </w:tc>
+        <w:tc>
+          <w:tcPr/>
+          <w:p>
+            <w:pPr>
+              <w:pStyle w:val="Compact"/>
+            </w:pPr>
+            <w:r>
+              <w:rPr>
+                <w:b/>
+                <w:bCs/>
+              </w:rPr>
+              <w:t xml:space="preserve">5.26 ± 0.6</w:t>
+            </w:r>
+          </w:p>
+        </w:tc>
+        <w:tc>
+          <w:tcPr/>
+          <w:p>
+            <w:pPr>
+              <w:pStyle w:val="Compact"/>
+            </w:pPr>
+            <w:r>
+              <w:rPr>
+                <w:b/>
+                <w:bCs/>
+              </w:rPr>
+              <w:t xml:space="preserve">0.0</w:t>
+            </w:r>
+          </w:p>
+        </w:tc>
+        <w:tc>
+          <w:tcPr/>
+          <w:p>
+            <w:pPr>
+              <w:pStyle w:val="Compact"/>
+            </w:pPr>
+            <w:r>
+              <w:t xml:space="preserve">111</w:t>
+            </w:r>
+          </w:p>
+        </w:tc>
+        <w:tc>
+          <w:tcPr/>
+          <w:p>
+            <w:pPr>
+              <w:pStyle w:val="Compact"/>
+            </w:pPr>
+            <w:r>
+              <w:t xml:space="preserve">6.53 ± 1.2</w:t>
+            </w:r>
+          </w:p>
+        </w:tc>
+        <w:tc>
+          <w:tcPr/>
+          <w:p>
+            <w:pPr>
+              <w:pStyle w:val="Compact"/>
+            </w:pPr>
+            <w:r>
+              <w:t xml:space="preserve">0.1</w:t>
+            </w:r>
+          </w:p>
+        </w:tc>
+        <w:tc>
+          <w:tcPr/>
+          <w:p>
+            <w:pPr>
+              <w:pStyle w:val="Compact"/>
+            </w:pPr>
+            <w:r>
+              <w:rPr>
+                <w:b/>
+                <w:bCs/>
+              </w:rPr>
+              <w:t xml:space="preserve">2.8 ms</w:t>
+            </w:r>
+          </w:p>
+        </w:tc>
+      </w:tr>
+      <w:tr>
+        <w:tc>
+          <w:tcPr/>
+          <w:p>
+            <w:pPr>
+              <w:pStyle w:val="Compact"/>
+            </w:pPr>
+            <w:r>
+              <w:t xml:space="preserve">DP-oracle</w:t>
+            </w:r>
+          </w:p>
+        </w:tc>
+        <w:tc>
+          <w:tcPr/>
+          <w:p>
+            <w:pPr>
+              <w:pStyle w:val="Compact"/>
+            </w:pPr>
+            <w:r>
+              <w:t xml:space="preserve">6.70</w:t>
+            </w:r>
+          </w:p>
+        </w:tc>
+        <w:tc>
+          <w:tcPr/>
+          <w:p>
+            <w:pPr>
+              <w:pStyle w:val="Compact"/>
+            </w:pPr>
+            <w:r>
+              <w:t xml:space="preserve">0.0</w:t>
+            </w:r>
+          </w:p>
+        </w:tc>
+        <w:tc>
+          <w:tcPr/>
+          <w:p>
+            <w:pPr>
+              <w:pStyle w:val="Compact"/>
+            </w:pPr>
+            <w:r>
+              <w:t xml:space="preserve">141</w:t>
+            </w:r>
+          </w:p>
+        </w:tc>
+        <w:tc>
+          <w:tcPr/>
+          <w:p>
+            <w:pPr>
+              <w:pStyle w:val="Compact"/>
+            </w:pPr>
+            <w:r>
+              <w:t xml:space="preserve">6.64 ± 0.8</w:t>
+            </w:r>
+          </w:p>
+        </w:tc>
+        <w:tc>
+          <w:tcPr/>
+          <w:p>
+            <w:pPr>
+              <w:pStyle w:val="Compact"/>
+            </w:pPr>
+            <w:r>
+              <w:t xml:space="preserve">0.0</w:t>
+            </w:r>
+          </w:p>
+        </w:tc>
+        <w:tc>
+          <w:tcPr/>
+          <w:p>
+            <w:pPr>
+              <w:pStyle w:val="Compact"/>
+            </w:pPr>
+            <w:r>
+              <w:t xml:space="preserve">6.3 s</w:t>
+            </w:r>
+          </w:p>
+        </w:tc>
+      </w:tr>
+      <w:tr>
+        <w:tc>
+          <w:tcPr/>
+          <w:p>
+            <w:pPr>
+              <w:pStyle w:val="Compact"/>
+            </w:pPr>
+            <w:r>
+              <w:t xml:space="preserve">MPC</w:t>
+            </w:r>
+          </w:p>
+        </w:tc>
+        <w:tc>
+          <w:tcPr/>
+          <w:p>
+            <w:pPr>
+              <w:pStyle w:val="Compact"/>
+            </w:pPr>
+            <w:r>
+              <w:t xml:space="preserve">6.70</w:t>
+            </w:r>
+          </w:p>
+        </w:tc>
+        <w:tc>
+          <w:tcPr/>
+          <w:p>
+            <w:pPr>
+              <w:pStyle w:val="Compact"/>
+            </w:pPr>
+            <w:r>
+              <w:t xml:space="preserve">0.0</w:t>
+            </w:r>
+          </w:p>
+        </w:tc>
+        <w:tc>
+          <w:tcPr/>
+          <w:p>
+            <w:pPr>
+              <w:pStyle w:val="Compact"/>
+            </w:pPr>
+            <w:r>
+              <w:t xml:space="preserve">141</w:t>
+            </w:r>
+          </w:p>
+        </w:tc>
+        <w:tc>
+          <w:tcPr/>
+          <w:p>
+            <w:pPr>
+              <w:pStyle w:val="Compact"/>
+            </w:pPr>
+            <w:r>
+              <w:t xml:space="preserve">6.91 ± 0.8</w:t>
+            </w:r>
+          </w:p>
+        </w:tc>
+        <w:tc>
+          <w:tcPr/>
+          <w:p>
+            <w:pPr>
+              <w:pStyle w:val="Compact"/>
+            </w:pPr>
+            <w:r>
+              <w:t xml:space="preserve">0.0</w:t>
+            </w:r>
+          </w:p>
+        </w:tc>
+        <w:tc>
+          <w:tcPr/>
+          <w:p>
+            <w:pPr>
+              <w:pStyle w:val="Compact"/>
+            </w:pPr>
+            <w:r>
+              <w:t xml:space="preserve">6.7 s</w:t>
+            </w:r>
+          </w:p>
+        </w:tc>
+      </w:tr>
+      <w:tr>
+        <w:tc>
+          <w:tcPr/>
+          <w:p>
+            <w:pPr>
+              <w:pStyle w:val="Compact"/>
+            </w:pPr>
+            <w:r>
+              <w:t xml:space="preserve">PPO</w:t>
+            </w:r>
+          </w:p>
+        </w:tc>
+        <w:tc>
+          <w:tcPr/>
+          <w:p>
+            <w:pPr>
+              <w:pStyle w:val="Compact"/>
+            </w:pPr>
+            <w:r>
+              <w:t xml:space="preserve">13.16 ± 1.6</w:t>
+            </w:r>
+          </w:p>
+        </w:tc>
+        <w:tc>
+          <w:tcPr/>
+          <w:p>
+            <w:pPr>
+              <w:pStyle w:val="Compact"/>
+            </w:pPr>
+            <w:r>
+              <w:t xml:space="preserve">0.0</w:t>
+            </w:r>
+          </w:p>
+        </w:tc>
+        <w:tc>
+          <w:tcPr/>
+          <w:p>
+            <w:pPr>
+              <w:pStyle w:val="Compact"/>
+            </w:pPr>
+            <w:r>
+              <w:t xml:space="preserve">602</w:t>
+            </w:r>
+          </w:p>
+        </w:tc>
+        <w:tc>
+          <w:tcPr/>
+          <w:p>
+            <w:pPr>
+              <w:pStyle w:val="Compact"/>
+            </w:pPr>
+            <w:r>
+              <w:t xml:space="preserve">12.91 ± 2.8</w:t>
+            </w:r>
+          </w:p>
+        </w:tc>
+        <w:tc>
+          <w:tcPr/>
+          <w:p>
+            <w:pPr>
+              <w:pStyle w:val="Compact"/>
+            </w:pPr>
+            <w:r>
+              <w:t xml:space="preserve">0.1</w:t>
+            </w:r>
+          </w:p>
+        </w:tc>
+        <w:tc>
+          <w:tcPr/>
+          <w:p>
+            <w:pPr>
+              <w:pStyle w:val="Compact"/>
+            </w:pPr>
+            <w:r>
+              <w:t xml:space="preserve">3.6 ms</w:t>
+            </w:r>
+          </w:p>
+        </w:tc>
+      </w:tr>
+      <w:tr>
+        <w:tc>
+          <w:tcPr/>
+          <w:p>
+            <w:pPr>
+              <w:pStyle w:val="Compact"/>
+            </w:pPr>
+            <w:r>
+              <w:t xml:space="preserve">SAC</w:t>
+            </w:r>
+          </w:p>
+        </w:tc>
+        <w:tc>
+          <w:tcPr/>
+          <w:p>
+            <w:pPr>
+              <w:pStyle w:val="Compact"/>
+            </w:pPr>
+            <w:r>
+              <w:t xml:space="preserve">16.07 ± 3.4</w:t>
+            </w:r>
+          </w:p>
+        </w:tc>
+        <w:tc>
+          <w:tcPr/>
+          <w:p>
+            <w:pPr>
+              <w:pStyle w:val="Compact"/>
+            </w:pPr>
+            <w:r>
+              <w:t xml:space="preserve">0.0</w:t>
+            </w:r>
+          </w:p>
+        </w:tc>
+        <w:tc>
+          <w:tcPr/>
+          <w:p>
+            <w:pPr>
+              <w:pStyle w:val="Compact"/>
+            </w:pPr>
+            <w:r>
+              <w:t xml:space="preserve">300</w:t>
+            </w:r>
+          </w:p>
+        </w:tc>
+        <w:tc>
+          <w:tcPr/>
+          <w:p>
+            <w:pPr>
+              <w:pStyle w:val="Compact"/>
+            </w:pPr>
+            <w:r>
+              <w:t xml:space="preserve">14.21 ± 3.5</w:t>
+            </w:r>
+          </w:p>
+        </w:tc>
+        <w:tc>
+          <w:tcPr/>
+          <w:p>
+            <w:pPr>
+              <w:pStyle w:val="Compact"/>
+            </w:pPr>
+            <w:r>
+              <w:t xml:space="preserve">0.0</w:t>
+            </w:r>
+          </w:p>
+        </w:tc>
+        <w:tc>
+          <w:tcPr/>
+          <w:p>
+            <w:pPr>
+              <w:pStyle w:val="Compact"/>
+            </w:pPr>
+            <w:r>
+              <w:t xml:space="preserve">4.9 ms</w:t>
+            </w:r>
+          </w:p>
+        </w:tc>
+      </w:tr>
+      <w:tr>
+        <w:tc>
+          <w:tcPr/>
+          <w:p>
+            <w:pPr>
+              <w:pStyle w:val="Compact"/>
+            </w:pPr>
+            <w:r>
+              <w:t xml:space="preserve">Constrained-SAC</w:t>
+            </w:r>
+          </w:p>
+        </w:tc>
+        <w:tc>
+          <w:tcPr/>
+          <w:p>
+            <w:pPr>
+              <w:pStyle w:val="Compact"/>
+            </w:pPr>
+            <w:r>
+              <w:t xml:space="preserve">17.08 ± 1.5</w:t>
+            </w:r>
+          </w:p>
+        </w:tc>
+        <w:tc>
+          <w:tcPr/>
+          <w:p>
+            <w:pPr>
+              <w:pStyle w:val="Compact"/>
+            </w:pPr>
+            <w:r>
+              <w:t xml:space="preserve">0.0</w:t>
+            </w:r>
+          </w:p>
+        </w:tc>
+        <w:tc>
+          <w:tcPr/>
+          <w:p>
+            <w:pPr>
+              <w:pStyle w:val="Compact"/>
+            </w:pPr>
+            <w:r>
+              <w:t xml:space="preserve">66</w:t>
+            </w:r>
+          </w:p>
+        </w:tc>
+        <w:tc>
+          <w:tcPr/>
+          <w:p>
+            <w:pPr>
+              <w:pStyle w:val="Compact"/>
+            </w:pPr>
+            <w:r>
+              <w:t xml:space="preserve">17.43 ± 1.6</w:t>
+            </w:r>
+          </w:p>
+        </w:tc>
+        <w:tc>
+          <w:tcPr/>
+          <w:p>
+            <w:pPr>
+              <w:pStyle w:val="Compact"/>
+            </w:pPr>
+            <w:r>
+              <w:t xml:space="preserve">0.0</w:t>
+            </w:r>
+          </w:p>
+        </w:tc>
+        <w:tc>
+          <w:tcPr/>
+          <w:p>
+            <w:pPr>
+              <w:pStyle w:val="Compact"/>
+            </w:pPr>
+            <w:r>
+              <w:t xml:space="preserve">4.7 ms</w:t>
+            </w:r>
+          </w:p>
+        </w:tc>
+      </w:tr>
+      <w:tr>
+        <w:tc>
+          <w:tcPr/>
+          <w:p>
+            <w:pPr>
+              <w:pStyle w:val="Compact"/>
+            </w:pPr>
+            <w:r>
+              <w:t xml:space="preserve">TD3</w:t>
+            </w:r>
+          </w:p>
+        </w:tc>
+        <w:tc>
+          <w:tcPr/>
+          <w:p>
+            <w:pPr>
+              <w:pStyle w:val="Compact"/>
+            </w:pPr>
+            <w:r>
+              <w:t xml:space="preserve">22.58 ± 8.7</w:t>
+            </w:r>
+          </w:p>
+        </w:tc>
+        <w:tc>
+          <w:tcPr/>
+          <w:p>
+            <w:pPr>
+              <w:pStyle w:val="Compact"/>
+            </w:pPr>
+            <w:r>
+              <w:t xml:space="preserve">0.3</w:t>
+            </w:r>
+          </w:p>
+        </w:tc>
+        <w:tc>
+          <w:tcPr/>
+          <w:p>
+            <w:pPr>
+              <w:pStyle w:val="Compact"/>
+            </w:pPr>
+            <w:r>
+              <w:t xml:space="preserve">1123</w:t>
+            </w:r>
+          </w:p>
+        </w:tc>
+        <w:tc>
+          <w:tcPr/>
+          <w:p>
+            <w:pPr>
+              <w:pStyle w:val="Compact"/>
+            </w:pPr>
+            <w:r>
+              <w:t xml:space="preserve">20.07 ± 7.5</w:t>
+            </w:r>
+          </w:p>
+        </w:tc>
+        <w:tc>
+          <w:tcPr/>
+          <w:p>
+            <w:pPr>
+              <w:pStyle w:val="Compact"/>
+            </w:pPr>
+            <w:r>
+              <w:t xml:space="preserve">0.4</w:t>
+            </w:r>
+          </w:p>
+        </w:tc>
+        <w:tc>
+          <w:tcPr/>
+          <w:p>
+            <w:pPr>
+              <w:pStyle w:val="Compact"/>
+            </w:pPr>
+            <w:r>
+              <w:t xml:space="preserve">4.4 ms</w:t>
+            </w:r>
+          </w:p>
+        </w:tc>
+      </w:tr>
+      <w:tr>
+        <w:tc>
+          <w:tcPr/>
+          <w:p>
+            <w:pPr>
+              <w:pStyle w:val="Compact"/>
+            </w:pPr>
+            <w:r>
+              <w:t xml:space="preserve">Rule-based</w:t>
+            </w:r>
+          </w:p>
+        </w:tc>
+        <w:tc>
+          <w:tcPr/>
+          <w:p>
+            <w:pPr>
+              <w:pStyle w:val="Compact"/>
+            </w:pPr>
+            <w:r>
+              <w:t xml:space="preserve">31.74</w:t>
+            </w:r>
+          </w:p>
+        </w:tc>
+        <w:tc>
+          <w:tcPr/>
+          <w:p>
+            <w:pPr>
+              <w:pStyle w:val="Compact"/>
+            </w:pPr>
+            <w:r>
+              <w:t xml:space="preserve">13.0</w:t>
+            </w:r>
+          </w:p>
+        </w:tc>
+        <w:tc>
+          <w:tcPr/>
+          <w:p>
+            <w:pPr>
+              <w:pStyle w:val="Compact"/>
+            </w:pPr>
+            <w:r>
+              <w:t xml:space="preserve">7388</w:t>
+            </w:r>
+          </w:p>
+        </w:tc>
+        <w:tc>
+          <w:tcPr/>
+          <w:p>
+            <w:pPr>
+              <w:pStyle w:val="Compact"/>
+            </w:pPr>
+            <w:r>
+              <w:t xml:space="preserve">32.15 ± 0.5</w:t>
+            </w:r>
+          </w:p>
+        </w:tc>
+        <w:tc>
+          <w:tcPr/>
+          <w:p>
+            <w:pPr>
+              <w:pStyle w:val="Compact"/>
+            </w:pPr>
+            <w:r>
+              <w:t xml:space="preserve">12.7</w:t>
+            </w:r>
+          </w:p>
+        </w:tc>
+        <w:tc>
+          <w:tcPr/>
+          <w:p>
+            <w:pPr>
+              <w:pStyle w:val="Compact"/>
+            </w:pPr>
+            <w:r>
+              <w:t xml:space="preserve">2.3 ms</w:t>
+            </w:r>
+          </w:p>
+        </w:tc>
+      </w:tr>
+    </w:tbl>
+    <w:p>
+      <w:pPr>
+        <w:pStyle w:val="BodyText"/>
+      </w:pPr>
+      <w:r>
+        <w:rPr>
+          <w:b/>
+          <w:bCs/>
+        </w:rPr>
+        <w:t xml:space="preserve">Reading the GasLib-40 results — the cleanest case for the method.</w:t>
+      </w:r>
+      <w:r>
+        <w:t xml:space="preserve"> </w:t>
+      </w:r>
+      <w:r>
+        <w:t xml:space="preserve">-</w:t>
+      </w:r>
+      <w:r>
+        <w:t xml:space="preserve"> </w:t>
+      </w:r>
+      <w:r>
+        <w:rPr>
+          <w:b/>
+          <w:bCs/>
+        </w:rPr>
+        <w:t xml:space="preserve">Distillation is the standout:</w:t>
+      </w:r>
+      <w:r>
+        <w:t xml:space="preserve"> </w:t>
+      </w:r>
+      <w:r>
+        <w:t xml:space="preserve">Distilled-MPC reaches cost</w:t>
+      </w:r>
+      <w:r>
+        <w:t xml:space="preserve"> </w:t>
+      </w:r>
+      <w:r>
+        <w:rPr>
+          <w:b/>
+          <w:bCs/>
+        </w:rPr>
+        <w:t xml:space="preserve">5.26 at zero violations</w:t>
+      </w:r>
+      <w:r>
+        <w:t xml:space="preserve"> </w:t>
+      </w:r>
+      <w:r>
+        <w:t xml:space="preserve">— it</w:t>
+      </w:r>
+      <w:r>
+        <w:t xml:space="preserve"> </w:t>
+      </w:r>
+      <w:r>
+        <w:t xml:space="preserve">matches the continuous GA optimum (5.57),</w:t>
+      </w:r>
+      <w:r>
+        <w:t xml:space="preserve"> </w:t>
+      </w:r>
+      <w:r>
+        <w:rPr>
+          <w:i/>
+          <w:iCs/>
+        </w:rPr>
+        <w:t xml:space="preserve">undercuts</w:t>
+      </w:r>
+      <w:r>
+        <w:t xml:space="preserve"> </w:t>
+      </w:r>
+      <w:r>
+        <w:t xml:space="preserve">the grid-MPC teacher (6.70), nails the</w:t>
+      </w:r>
+      <w:r>
+        <w:t xml:space="preserve"> </w:t>
+      </w:r>
+      <w:r>
+        <w:t xml:space="preserve">terminal target, and runs in</w:t>
+      </w:r>
+      <w:r>
+        <w:t xml:space="preserve"> </w:t>
+      </w:r>
+      <w:r>
+        <w:rPr>
+          <w:b/>
+          <w:bCs/>
+        </w:rPr>
+        <w:t xml:space="preserve">2.8 ms (≈2300× faster than the 6.5 s MPC)</w:t>
+      </w:r>
+      <w:r>
+        <w:t xml:space="preserve">. On a real-geometry</w:t>
+      </w:r>
+      <w:r>
+        <w:t xml:space="preserve"> </w:t>
+      </w:r>
+      <w:r>
+        <w:t xml:space="preserve">network the</w:t>
+      </w:r>
+      <w:r>
+        <w:t xml:space="preserve"> </w:t>
+      </w:r>
+      <w:r>
+        <w:t xml:space="preserve">“distil a model-based controller”</w:t>
+      </w:r>
+      <w:r>
+        <w:t xml:space="preserve"> </w:t>
+      </w:r>
+      <w:r>
+        <w:t xml:space="preserve">recipe gives the best learned controller outright.</w:t>
+      </w:r>
+      <w:r>
+        <w:t xml:space="preserve"> </w:t>
+      </w:r>
+      <w:r>
+        <w:t xml:space="preserve">-</w:t>
+      </w:r>
+      <w:r>
+        <w:t xml:space="preserve"> </w:t>
+      </w:r>
+      <w:r>
+        <w:rPr>
+          <w:b/>
+          <w:bCs/>
+        </w:rPr>
+        <w:t xml:space="preserve">DP/MPC are clean here.</w:t>
+      </w:r>
+      <w:r>
+        <w:t xml:space="preserve"> </w:t>
+      </w:r>
+      <w:r>
+        <w:t xml:space="preserve">Unlike the branched benchmark, the chain topology keeps the 3-D grid</w:t>
+      </w:r>
+      <w:r>
+        <w:t xml:space="preserve"> </w:t>
+      </w:r>
+      <w:r>
+        <w:t xml:space="preserve">DP feasible (0 violations), so DP/MPC are valid references on this network.</w:t>
+      </w:r>
+      <w:r>
+        <w:t xml:space="preserve"> </w:t>
+      </w:r>
+      <w:r>
+        <w:t xml:space="preserve">-</w:t>
+      </w:r>
+      <w:r>
+        <w:t xml:space="preserve"> </w:t>
+      </w:r>
+      <w:r>
+        <w:rPr>
+          <w:b/>
+          <w:bCs/>
+        </w:rPr>
+        <w:t xml:space="preserve">Constraint-aware SAC’s reliability advantage reappears:</w:t>
+      </w:r>
+      <w:r>
+        <w:t xml:space="preserve"> </w:t>
+      </w:r>
+      <w:r>
+        <w:t xml:space="preserve">it is feasible with the tightest</w:t>
+      </w:r>
+      <w:r>
+        <w:t xml:space="preserve"> </w:t>
+      </w:r>
+      <w:r>
+        <w:t xml:space="preserve">terminal compliance (gap 66 vs SAC’s 300) and the lowest seed variance (±1.5 vs SAC ±3.4) —</w:t>
+      </w:r>
+      <w:r>
+        <w:t xml:space="preserve"> </w:t>
+      </w:r>
+      <w:r>
+        <w:t xml:space="preserve">the opposite of the branched case, confirming the ranking is network-dependent but that</w:t>
+      </w:r>
+      <w:r>
+        <w:t xml:space="preserve"> </w:t>
+      </w:r>
+      <w:r>
+        <w:t xml:space="preserve">Constrained-SAC is the more reliable from-scratch learner where the dual settings suit the network.</w:t>
+      </w:r>
+      <w:r>
+        <w:t xml:space="preserve"> </w:t>
+      </w:r>
+      <w:r>
+        <w:t xml:space="preserve">-</w:t>
+      </w:r>
+      <w:r>
+        <w:t xml:space="preserve"> </w:t>
+      </w:r>
+      <w:r>
+        <w:rPr>
+          <w:b/>
+          <w:bCs/>
+        </w:rPr>
+        <w:t xml:space="preserve">The core enabler holds a third time:</w:t>
+      </w:r>
+      <w:r>
+        <w:t xml:space="preserve"> </w:t>
+      </w:r>
+      <w:r>
+        <w:t xml:space="preserve">every feasibility-aware DRL agent is feasible (TD3 the</w:t>
+      </w:r>
+      <w:r>
+        <w:t xml:space="preserve"> </w:t>
+      </w:r>
+      <w:r>
+        <w:t xml:space="preserve">only wobble at 0.3), and the from-scratch cost premium (~2.5–3×) is again removed by distillation.</w:t>
+      </w:r>
+    </w:p>
+    <w:p>
+      <w:pPr>
+        <w:pStyle w:val="BodyText"/>
+      </w:pPr>
+      <w:r>
+        <w:t xml:space="preserve">Across all three networks the conclusion is consistent: feasibility transfers, distillation delivers</w:t>
+      </w:r>
+      <w:r>
+        <w:t xml:space="preserve"> </w:t>
+      </w:r>
+      <w:r>
+        <w:t xml:space="preserve">near-optimal feasible control at millisecond latency, and from-scratch RL trails on cost.</w:t>
+      </w:r>
+    </w:p>
+    <w:p>
+      <w:pPr>
+        <w:pStyle w:val="CaptionedFigure"/>
+      </w:pPr>
+      <w:r>
+        <w:drawing>
+          <wp:inline>
+            <wp:extent cx="5334000" cy="2963333"/>
+            <wp:effectExtent b="0" l="0" r="0" t="0"/>
+            <wp:docPr descr="Figure 10. GasLib-40-derived network — nominal 24-h cost by method (mean ± std)." title="" id="66" name="Picture"/>
+            <a:graphic>
+              <a:graphicData uri="http://schemas.openxmlformats.org/drawingml/2006/picture">
+                <pic:pic>
+                  <pic:nvPicPr>
+                    <pic:cNvPr descr="../models/exports/paper_gaslib/fig_cost_nominal.png" id="67" name="Picture"/>
+                    <pic:cNvPicPr>
+                      <a:picLocks noChangeArrowheads="1" noChangeAspect="1"/>
+                    </pic:cNvPicPr>
+                  </pic:nvPicPr>
+                  <pic:blipFill>
+                    <a:blip r:embed="rId65"/>
+                    <a:stretch>
+                      <a:fillRect/>
+                    </a:stretch>
+                  </pic:blipFill>
+                  <pic:spPr bwMode="auto">
+                    <a:xfrm>
+                      <a:off x="0" y="0"/>
+                      <a:ext cx="5334000" cy="2963333"/>
+                    </a:xfrm>
+                    <a:prstGeom prst="rect">
+                      <a:avLst/>
+                    </a:prstGeom>
+                    <a:noFill/>
+                    <a:ln w="9525">
+                      <a:noFill/>
+                      <a:headEnd/>
+                      <a:tailEnd/>
+                    </a:ln>
+                  </pic:spPr>
+                </pic:pic>
+              </a:graphicData>
+            </a:graphic>
+          </wp:inline>
+        </w:drawing>
+      </w:r>
+    </w:p>
+    <w:p>
+      <w:pPr>
+        <w:pStyle w:val="ImageCaption"/>
+      </w:pPr>
+      <w:r>
+        <w:t xml:space="preserve">Figure 10. GasLib-40-derived network — nominal 24-h cost by method (mean ± std).</w:t>
+      </w:r>
+    </w:p>
+    <w:bookmarkEnd w:id="68"/>
+    <w:bookmarkStart w:id="75" w:name="Xf9220d48202e1504a5c801e8ce7a4bd85b82bd7"/>
+    <w:p>
+      <w:pPr>
+        <w:pStyle w:val="Heading3"/>
+      </w:pPr>
+      <w:r>
+        <w:t xml:space="preserve">6.10 Summary: cost–latency trade-off and cross-network consistency</w:t>
+      </w:r>
+    </w:p>
+    <w:p>
+      <w:pPr>
+        <w:pStyle w:val="FirstParagraph"/>
+      </w:pPr>
+      <w:r>
+        <w:t xml:space="preserve">Two summary views consolidate the story. Figure 11 plots</w:t>
+      </w:r>
+      <w:r>
+        <w:t xml:space="preserve"> </w:t>
+      </w:r>
+      <w:r>
+        <w:rPr>
+          <w:b/>
+          <w:bCs/>
+        </w:rPr>
+        <w:t xml:space="preserve">cost against deployment latency</w:t>
+      </w:r>
+      <w:r>
+        <w:t xml:space="preserve"> </w:t>
+      </w:r>
+      <w:r>
+        <w:t xml:space="preserve">on the</w:t>
+      </w:r>
+      <w:r>
+        <w:t xml:space="preserve"> </w:t>
+      </w:r>
+      <w:r>
+        <w:t xml:space="preserve">gun-barrel network: the model-based optimisers (DP/MPC/GA) sit at low cost but high latency</w:t>
+      </w:r>
+      <w:r>
+        <w:t xml:space="preserve"> </w:t>
+      </w:r>
+      <w:r>
+        <w:t xml:space="preserve">(1–11 s), the from-scratch DRL agents are fast (~5 ms) but pay a cost premium, and</w:t>
+      </w:r>
+      <w:r>
+        <w:t xml:space="preserve"> </w:t>
+      </w:r>
+      <w:r>
+        <w:rPr>
+          <w:b/>
+          <w:bCs/>
+        </w:rPr>
+        <w:t xml:space="preserve">Distilled-MPC</w:t>
+      </w:r>
+      <w:r>
+        <w:rPr>
+          <w:b/>
+          <w:bCs/>
+        </w:rPr>
+        <w:t xml:space="preserve"> </w:t>
+      </w:r>
+      <w:r>
+        <w:rPr>
+          <w:b/>
+          <w:bCs/>
+        </w:rPr>
+        <w:t xml:space="preserve">occupies the ideal lower-left corner</w:t>
+      </w:r>
+      <w:r>
+        <w:t xml:space="preserve"> </w:t>
+      </w:r>
+      <w:r>
+        <w:t xml:space="preserve">— the lowest cost</w:t>
+      </w:r>
+      <w:r>
+        <w:t xml:space="preserve"> </w:t>
+      </w:r>
+      <w:r>
+        <w:rPr>
+          <w:i/>
+          <w:iCs/>
+        </w:rPr>
+        <w:t xml:space="preserve">and</w:t>
+      </w:r>
+      <w:r>
+        <w:t xml:space="preserve"> </w:t>
+      </w:r>
+      <w:r>
+        <w:t xml:space="preserve">millisecond latency. Figure 12</w:t>
+      </w:r>
+      <w:r>
+        <w:t xml:space="preserve"> </w:t>
+      </w:r>
+      <w:r>
+        <w:t xml:space="preserve">normalises each method’s cost by the per-network DP optimum across all three networks: GA, MPC and</w:t>
+      </w:r>
+      <w:r>
+        <w:t xml:space="preserve"> </w:t>
+      </w:r>
+      <w:r>
+        <w:t xml:space="preserve">Distilled-MPC stay at ≈1× everywhere, while from-scratch SAC/Constrained-SAC carry a consistent</w:t>
+      </w:r>
+      <w:r>
+        <w:t xml:space="preserve"> </w:t>
+      </w:r>
+      <w:r>
+        <w:t xml:space="preserve">≈2–3× premium (the one exception being SAC on the branched network, where the coarse 3-D grid DP</w:t>
+      </w:r>
+      <w:r>
+        <w:t xml:space="preserve"> </w:t>
+      </w:r>
+      <w:r>
+        <w:t xml:space="preserve">reference is itself loose). The two figures together capture the paper’s thesis:</w:t>
+      </w:r>
+      <w:r>
+        <w:t xml:space="preserve"> </w:t>
+      </w:r>
+      <w:r>
+        <w:rPr>
+          <w:i/>
+          <w:iCs/>
+        </w:rPr>
+        <w:t xml:space="preserve">distillation gives</w:t>
+      </w:r>
+      <w:r>
+        <w:rPr>
+          <w:i/>
+          <w:iCs/>
+        </w:rPr>
+        <w:t xml:space="preserve"> </w:t>
+      </w:r>
+      <w:r>
+        <w:rPr>
+          <w:i/>
+          <w:iCs/>
+        </w:rPr>
+        <w:t xml:space="preserve">near-optimal cost at real-time latency, consistently across networks; from-scratch RL is fast and</w:t>
+      </w:r>
+      <w:r>
+        <w:rPr>
+          <w:i/>
+          <w:iCs/>
+        </w:rPr>
+        <w:t xml:space="preserve"> </w:t>
+      </w:r>
+      <w:r>
+        <w:rPr>
+          <w:i/>
+          <w:iCs/>
+        </w:rPr>
+        <w:t xml:space="preserve">feasible but cost-suboptimal.</w:t>
+      </w:r>
+    </w:p>
+    <w:p>
+      <w:pPr>
+        <w:pStyle w:val="CaptionedFigure"/>
+      </w:pPr>
+      <w:r>
+        <w:drawing>
+          <wp:inline>
+            <wp:extent cx="5334000" cy="3339242"/>
+            <wp:effectExtent b="0" l="0" r="0" t="0"/>
+            <wp:docPr descr="Figure 11. Cost vs deployment latency on the gun-barrel network (latency on a log scale; green = feasible, red = infeasible; ★ = Distilled-MPC). Lower-left is better — cheaper and faster." title="" id="70" name="Picture"/>
+            <a:graphic>
+              <a:graphicData uri="http://schemas.openxmlformats.org/drawingml/2006/picture">
+                <pic:pic>
+                  <pic:nvPicPr>
+                    <pic:cNvPr descr="fig_cost_latency.png" id="71" name="Picture"/>
+                    <pic:cNvPicPr>
+                      <a:picLocks noChangeArrowheads="1" noChangeAspect="1"/>
+                    </pic:cNvPicPr>
+                  </pic:nvPicPr>
+                  <pic:blipFill>
+                    <a:blip r:embed="rId69"/>
+                    <a:stretch>
+                      <a:fillRect/>
+                    </a:stretch>
+                  </pic:blipFill>
+                  <pic:spPr bwMode="auto">
+                    <a:xfrm>
+                      <a:off x="0" y="0"/>
+                      <a:ext cx="5334000" cy="3339242"/>
+                    </a:xfrm>
+                    <a:prstGeom prst="rect">
+                      <a:avLst/>
+                    </a:prstGeom>
+                    <a:noFill/>
+                    <a:ln w="9525">
+                      <a:noFill/>
+                      <a:headEnd/>
+                      <a:tailEnd/>
+                    </a:ln>
+                  </pic:spPr>
+                </pic:pic>
+              </a:graphicData>
+            </a:graphic>
+          </wp:inline>
+        </w:drawing>
+      </w:r>
+    </w:p>
+    <w:p>
+      <w:pPr>
+        <w:pStyle w:val="ImageCaption"/>
+      </w:pPr>
+      <w:r>
+        <w:t xml:space="preserve">Figure 11. Cost vs deployment latency on the gun-barrel network (latency on a log scale; green = feasible, red = infeasible; ★ = Distilled-MPC). Lower-left is better — cheaper and faster.</w:t>
+      </w:r>
+    </w:p>
+    <w:p>
+      <w:pPr>
+        <w:pStyle w:val="CaptionedFigure"/>
+      </w:pPr>
+      <w:r>
+        <w:drawing>
+          <wp:inline>
+            <wp:extent cx="5334000" cy="2580708"/>
+            <wp:effectExtent b="0" l="0" r="0" t="0"/>
+            <wp:docPr descr="Figure 12. Nominal cost normalised by the per-network DP optimum (×1 dashed line), for the key methods across the gun-barrel, branched, and GasLib-40 networks. Distilled-MPC ≈ optimum everywhere; from-scratch SAC/Constrained-SAC carry a premium." title="" id="73" name="Picture"/>
+            <a:graphic>
+              <a:graphicData uri="http://schemas.openxmlformats.org/drawingml/2006/picture">
+                <pic:pic>
+                  <pic:nvPicPr>
+                    <pic:cNvPr descr="fig_summary_networks.png" id="74" name="Picture"/>
+                    <pic:cNvPicPr>
+                      <a:picLocks noChangeArrowheads="1" noChangeAspect="1"/>
+                    </pic:cNvPicPr>
+                  </pic:nvPicPr>
+                  <pic:blipFill>
+                    <a:blip r:embed="rId72"/>
+                    <a:stretch>
+                      <a:fillRect/>
+                    </a:stretch>
+                  </pic:blipFill>
+                  <pic:spPr bwMode="auto">
+                    <a:xfrm>
+                      <a:off x="0" y="0"/>
+                      <a:ext cx="5334000" cy="2580708"/>
+                    </a:xfrm>
+                    <a:prstGeom prst="rect">
+                      <a:avLst/>
+                    </a:prstGeom>
+                    <a:noFill/>
+                    <a:ln w="9525">
+                      <a:noFill/>
+                      <a:headEnd/>
+                      <a:tailEnd/>
+                    </a:ln>
+                  </pic:spPr>
+                </pic:pic>
+              </a:graphicData>
+            </a:graphic>
+          </wp:inline>
+        </w:drawing>
+      </w:r>
+    </w:p>
+    <w:p>
+      <w:pPr>
+        <w:pStyle w:val="ImageCaption"/>
+      </w:pPr>
+      <w:r>
+        <w:t xml:space="preserve">Figure 12. Nominal cost normalised by the per-network DP optimum (×1 dashed line), for the key methods across the gun-barrel, branched, and GasLib-40 networks. Distilled-MPC ≈ optimum everywhere; from-scratch SAC/Constrained-SAC carry a premium.</w:t>
       </w:r>
     </w:p>
     <w:p>
@@ -12998,9 +13317,9 @@
         </w:pict>
       </w:r>
     </w:p>
-    <w:bookmarkEnd w:id="65"/>
-    <w:bookmarkEnd w:id="66"/>
-    <w:bookmarkStart w:id="67" w:name="discussion-and-limitations"/>
+    <w:bookmarkEnd w:id="75"/>
+    <w:bookmarkEnd w:id="76"/>
+    <w:bookmarkStart w:id="77" w:name="discussion-and-limitations"/>
     <w:p>
       <w:pPr>
         <w:pStyle w:val="Heading2"/>
@@ -13507,8 +13826,8 @@
         </w:pict>
       </w:r>
     </w:p>
-    <w:bookmarkEnd w:id="67"/>
-    <w:bookmarkStart w:id="68" w:name="conclusion"/>
+    <w:bookmarkEnd w:id="77"/>
+    <w:bookmarkStart w:id="78" w:name="conclusion"/>
     <w:p>
       <w:pPr>
         <w:pStyle w:val="Heading2"/>
@@ -13739,8 +14058,8 @@
         </w:pict>
       </w:r>
     </w:p>
-    <w:bookmarkEnd w:id="68"/>
-    <w:bookmarkStart w:id="69" w:name="references"/>
+    <w:bookmarkEnd w:id="78"/>
+    <w:bookmarkStart w:id="79" w:name="references"/>
     <w:p>
       <w:pPr>
         <w:pStyle w:val="Heading2"/>
@@ -15318,8 +15637,8 @@
         <w:t xml:space="preserve">, 52:90–99, 2013.</w:t>
       </w:r>
     </w:p>
-    <w:bookmarkEnd w:id="69"/>
-    <w:bookmarkEnd w:id="70"/>
+    <w:bookmarkEnd w:id="79"/>
+    <w:bookmarkEnd w:id="80"/>
     <w:sectPr>
       <w:footnotePr>
         <w:numRestart w:val="eachSect"/>

</xml_diff>